<commit_message>
site: sync 2026-10-19 17:57
</commit_message>
<xml_diff>
--- a/documents/files/segmentation.docx
+++ b/documents/files/segmentation.docx
@@ -31,10 +31,7 @@
         <w:pStyle w:val="FirstParagraph"/>
       </w:pPr>
       <w:r>
-        <w:t xml:space="preserve">从动态 N×N 相关系数矩阵中检测沿主对角线的连续块边界。本文档整理现有两条技术路线（SVM 历史基线、CNN 当前主线）的口径与结论，并为</w:t>
-      </w:r>
-      <w:r>
-        <w:t xml:space="preserve"> </w:t>
+        <w:t xml:space="preserve">从动态 N×N 相关系数矩阵中检测沿主对角线的连续块边界。本文档按三条路线组织：</w:t>
       </w:r>
       <w:r>
         <w:rPr>
@@ -44,7 +41,16 @@
         <w:t xml:space="preserve">daninet 方案</w:t>
       </w:r>
       <w:r>
-        <w:t xml:space="preserve">预留位置——新模型训练完成后按同一格式补入顶部。</w:t>
+        <w:t xml:space="preserve">（</w:t>
+      </w:r>
+      <w:r>
+        <w:rPr>
+          <w:rStyle w:val="VerbatimChar"/>
+        </w:rPr>
+        <w:t xml:space="preserve">daninet/edge</w:t>
+      </w:r>
+      <w:r>
+        <w:t xml:space="preserve">，合成数据，置顶）、SVM 历史基线、CNN 当前主线（真实数据）。各路线的数字来自各自工件，不可横向混比。</w:t>
       </w:r>
     </w:p>
     <w:p>
@@ -134,13 +140,25 @@
         </w:pict>
       </w:r>
     </w:p>
-    <w:bookmarkStart w:id="20" w:name="一daninet-方案占位--待新模型训练后补充"/>
+    <w:bookmarkStart w:id="20" w:name="一daninet-方案daninetedge--2026-10-19-首批结果"/>
     <w:p>
       <w:pPr>
         <w:pStyle w:val="Heading2"/>
       </w:pPr>
       <w:r>
-        <w:t xml:space="preserve">一、daninet 方案（占位 · 待新模型训练后补充）</w:t>
+        <w:t xml:space="preserve">一、daninet 方案（</w:t>
+      </w:r>
+      <w:r>
+        <w:rPr>
+          <w:rStyle w:val="VerbatimChar"/>
+        </w:rPr>
+        <w:t xml:space="preserve">daninet/edge</w:t>
+      </w:r>
+      <w:r>
+        <w:t xml:space="preserve"> </w:t>
+      </w:r>
+      <w:r>
+        <w:t xml:space="preserve">· 2026-10-19 首批结果）</w:t>
       </w:r>
     </w:p>
     <w:p>
@@ -148,17 +166,25 @@
         <w:pStyle w:val="FirstParagraph"/>
       </w:pPr>
       <w:r>
-        <w:rPr>
-          <w:b/>
-          <w:bCs/>
-        </w:rPr>
-        <w:t xml:space="preserve">状态：预留</w:t>
-      </w:r>
-      <w:r>
-        <w:t xml:space="preserve"> </w:t>
-      </w:r>
-      <w:r>
-        <w:t xml:space="preserve">— 你训练出新模型后，把下列条目填满即可替换本段。</w:t>
+        <w:t xml:space="preserve">来源：</w:t>
+      </w:r>
+      <w:r>
+        <w:rPr>
+          <w:rStyle w:val="VerbatimChar"/>
+        </w:rPr>
+        <w:t xml:space="preserve">daninet/runs/edge_ensemble3_notta/{metrics,evaluation,decode_eval}.json</w:t>
+      </w:r>
+      <w:r>
+        <w:t xml:space="preserve">、</w:t>
+      </w:r>
+      <w:r>
+        <w:rPr>
+          <w:rStyle w:val="VerbatimChar"/>
+        </w:rPr>
+        <w:t xml:space="preserve">daninet/out/edge_segmentation/summary.json</w:t>
+      </w:r>
+      <w:r>
+        <w:t xml:space="preserve">。合成数据训练，非真实数据。</w:t>
       </w:r>
     </w:p>
     <w:tbl>
@@ -169,8 +195,8 @@
         <w:tblLook w:firstRow="1" w:lastRow="0" w:firstColumn="0" w:lastColumn="0" w:noHBand="0" w:noVBand="0" w:val="0020"/>
       </w:tblPr>
       <w:tblGrid>
-        <w:gridCol w:w="3433"/>
-        <w:gridCol w:w="6205"/>
+        <w:gridCol w:w="2010"/>
+        <w:gridCol w:w="7628"/>
       </w:tblGrid>
       <w:tr>
         <w:trPr>
@@ -178,7 +204,7 @@
         </w:trPr>
         <w:tc>
           <w:tcPr>
-            <w:tcW w:w="3433" w:type="dxa"/>
+            <w:tcW w:w="2010" w:type="dxa"/>
           </w:tcPr>
           <w:p>
             <w:pPr>
@@ -192,7 +218,7 @@
         </w:tc>
         <w:tc>
           <w:tcPr>
-            <w:tcW w:w="6205" w:type="dxa"/>
+            <w:tcW w:w="7628" w:type="dxa"/>
           </w:tcPr>
           <w:p>
             <w:pPr>
@@ -208,7 +234,7 @@
       <w:tr>
         <w:tc>
           <w:tcPr>
-            <w:tcW w:w="3433" w:type="dxa"/>
+            <w:tcW w:w="2010" w:type="dxa"/>
           </w:tcPr>
           <w:p>
             <w:pPr>
@@ -222,15 +248,27 @@
         </w:tc>
         <w:tc>
           <w:tcPr>
-            <w:tcW w:w="6205" w:type="dxa"/>
-          </w:tcPr>
-          <w:p>
-            <w:pPr>
-              <w:pStyle w:val="Compact"/>
-              <w:jc w:val="left"/>
-            </w:pPr>
-            <w:r>
-              <w:t xml:space="preserve">N×N 相关系数矩阵（待确认通道数与预处理）</w:t>
+            <w:tcW w:w="7628" w:type="dxa"/>
+          </w:tcPr>
+          <w:p>
+            <w:pPr>
+              <w:pStyle w:val="Compact"/>
+              <w:jc w:val="left"/>
+            </w:pPr>
+            <w:r>
+              <w:t xml:space="preserve">N×N 相关矩阵，5 通道（</w:t>
+            </w:r>
+            <w:r>
+              <w:rPr>
+                <w:rStyle w:val="VerbatimChar"/>
+              </w:rPr>
+              <w:t xml:space="preserve">normalized_gradient_svd</w:t>
+            </w:r>
+            <w:r>
+              <w:t xml:space="preserve"> </w:t>
+            </w:r>
+            <w:r>
+              <w:t xml:space="preserve">特征模式）</w:t>
             </w:r>
           </w:p>
         </w:tc>
@@ -238,7 +276,7 @@
       <w:tr>
         <w:tc>
           <w:tcPr>
-            <w:tcW w:w="3433" w:type="dxa"/>
+            <w:tcW w:w="2010" w:type="dxa"/>
           </w:tcPr>
           <w:p>
             <w:pPr>
@@ -252,15 +290,15 @@
         </w:tc>
         <w:tc>
           <w:tcPr>
-            <w:tcW w:w="6205" w:type="dxa"/>
-          </w:tcPr>
-          <w:p>
-            <w:pPr>
-              <w:pStyle w:val="Compact"/>
-              <w:jc w:val="left"/>
-            </w:pPr>
-            <w:r>
-              <w:t xml:space="preserve">长度 N−1 的边界向量，或逐位置概率</w:t>
+            <w:tcW w:w="7628" w:type="dxa"/>
+          </w:tcPr>
+          <w:p>
+            <w:pPr>
+              <w:pStyle w:val="Compact"/>
+              <w:jc w:val="left"/>
+            </w:pPr>
+            <w:r>
+              <w:t xml:space="preserve">长度 N−1 的逐候选边界判定</w:t>
             </w:r>
           </w:p>
         </w:tc>
@@ -268,7 +306,7 @@
       <w:tr>
         <w:tc>
           <w:tcPr>
-            <w:tcW w:w="3433" w:type="dxa"/>
+            <w:tcW w:w="2010" w:type="dxa"/>
           </w:tcPr>
           <w:p>
             <w:pPr>
@@ -282,15 +320,15 @@
         </w:tc>
         <w:tc>
           <w:tcPr>
-            <w:tcW w:w="6205" w:type="dxa"/>
-          </w:tcPr>
-          <w:p>
-            <w:pPr>
-              <w:pStyle w:val="Compact"/>
-              <w:jc w:val="left"/>
-            </w:pPr>
-            <w:r>
-              <w:t xml:space="preserve">待补（层数 / 通道 / 感受野）</w:t>
+            <w:tcW w:w="7628" w:type="dxa"/>
+          </w:tcPr>
+          <w:p>
+            <w:pPr>
+              <w:pStyle w:val="Compact"/>
+              <w:jc w:val="left"/>
+            </w:pPr>
+            <w:r>
+              <w:t xml:space="preserve">多尺度残差骨干：in 5 / stem 16 / hidden 128 × 5 块，head 64（8 组），深监督侧头 [1, 3]</w:t>
             </w:r>
           </w:p>
         </w:tc>
@@ -298,7 +336,7 @@
       <w:tr>
         <w:tc>
           <w:tcPr>
-            <w:tcW w:w="3433" w:type="dxa"/>
+            <w:tcW w:w="2010" w:type="dxa"/>
           </w:tcPr>
           <w:p>
             <w:pPr>
@@ -312,15 +350,15 @@
         </w:tc>
         <w:tc>
           <w:tcPr>
-            <w:tcW w:w="6205" w:type="dxa"/>
-          </w:tcPr>
-          <w:p>
-            <w:pPr>
-              <w:pStyle w:val="Compact"/>
-              <w:jc w:val="left"/>
-            </w:pPr>
-            <w:r>
-              <w:t xml:space="preserve">待补（数据量、epoch、batch、学习率日程）</w:t>
+            <w:tcW w:w="7628" w:type="dxa"/>
+          </w:tcPr>
+          <w:p>
+            <w:pPr>
+              <w:pStyle w:val="Compact"/>
+              <w:jc w:val="left"/>
+            </w:pPr>
+            <w:r>
+              <w:t xml:space="preserve">合成生成器：尺寸 14/17（未见尺寸 25），最小块宽 2，最多 4 个边界；L 训练 [9, 16, 36, 121]，测试 [9, 16, 25, 36, 49, 121]；split seed 20260713</w:t>
             </w:r>
           </w:p>
         </w:tc>
@@ -328,29 +366,38 @@
       <w:tr>
         <w:tc>
           <w:tcPr>
-            <w:tcW w:w="3433" w:type="dxa"/>
-          </w:tcPr>
-          <w:p>
-            <w:pPr>
-              <w:pStyle w:val="Compact"/>
-              <w:jc w:val="left"/>
-            </w:pPr>
-            <w:r>
-              <w:t xml:space="preserve">权重位置</w:t>
-            </w:r>
-          </w:p>
-        </w:tc>
-        <w:tc>
-          <w:tcPr>
-            <w:tcW w:w="6205" w:type="dxa"/>
-          </w:tcPr>
-          <w:p>
-            <w:pPr>
-              <w:pStyle w:val="Compact"/>
-              <w:jc w:val="left"/>
-            </w:pPr>
-            <w:r>
-              <w:t xml:space="preserve">待补</w:t>
+            <w:tcW w:w="2010" w:type="dxa"/>
+          </w:tcPr>
+          <w:p>
+            <w:pPr>
+              <w:pStyle w:val="Compact"/>
+              <w:jc w:val="left"/>
+            </w:pPr>
+            <w:r>
+              <w:t xml:space="preserve">集成</w:t>
+            </w:r>
+          </w:p>
+        </w:tc>
+        <w:tc>
+          <w:tcPr>
+            <w:tcW w:w="7628" w:type="dxa"/>
+          </w:tcPr>
+          <w:p>
+            <w:pPr>
+              <w:pStyle w:val="Compact"/>
+              <w:jc w:val="left"/>
+            </w:pPr>
+            <w:r>
+              <w:t xml:space="preserve">3 模型（</w:t>
+            </w:r>
+            <w:r>
+              <w:rPr>
+                <w:rStyle w:val="VerbatimChar"/>
+              </w:rPr>
+              <w:t xml:space="preserve">edge_s20260713/14/15</w:t>
+            </w:r>
+            <w:r>
+              <w:t xml:space="preserve">），无 TTA，单卡 NPU</w:t>
             </w:r>
           </w:p>
         </w:tc>
@@ -358,29 +405,41 @@
       <w:tr>
         <w:tc>
           <w:tcPr>
-            <w:tcW w:w="3433" w:type="dxa"/>
-          </w:tcPr>
-          <w:p>
-            <w:pPr>
-              <w:pStyle w:val="Compact"/>
-              <w:jc w:val="left"/>
-            </w:pPr>
-            <w:r>
-              <w:t xml:space="preserve">Test Exact</w:t>
-            </w:r>
-          </w:p>
-        </w:tc>
-        <w:tc>
-          <w:tcPr>
-            <w:tcW w:w="6205" w:type="dxa"/>
-          </w:tcPr>
-          <w:p>
-            <w:pPr>
-              <w:pStyle w:val="Compact"/>
-              <w:jc w:val="left"/>
-            </w:pPr>
-            <w:r>
-              <w:t xml:space="preserve">待补</w:t>
+            <w:tcW w:w="2010" w:type="dxa"/>
+          </w:tcPr>
+          <w:p>
+            <w:pPr>
+              <w:pStyle w:val="Compact"/>
+              <w:jc w:val="left"/>
+            </w:pPr>
+            <w:r>
+              <w:t xml:space="preserve">权重位置</w:t>
+            </w:r>
+          </w:p>
+        </w:tc>
+        <w:tc>
+          <w:tcPr>
+            <w:tcW w:w="7628" w:type="dxa"/>
+          </w:tcPr>
+          <w:p>
+            <w:pPr>
+              <w:pStyle w:val="Compact"/>
+              <w:jc w:val="left"/>
+            </w:pPr>
+            <w:r>
+              <w:rPr>
+                <w:rStyle w:val="VerbatimChar"/>
+              </w:rPr>
+              <w:t xml:space="preserve">daninet/runs/edge_s2026071*/</w:t>
+            </w:r>
+            <w:r>
+              <w:t xml:space="preserve">、</w:t>
+            </w:r>
+            <w:r>
+              <w:rPr>
+                <w:rStyle w:val="VerbatimChar"/>
+              </w:rPr>
+              <w:t xml:space="preserve">daninet/runs/edge_ensemble3_notta/</w:t>
             </w:r>
           </w:p>
         </w:tc>
@@ -388,29 +447,41 @@
       <w:tr>
         <w:tc>
           <w:tcPr>
-            <w:tcW w:w="3433" w:type="dxa"/>
-          </w:tcPr>
-          <w:p>
-            <w:pPr>
-              <w:pStyle w:val="Compact"/>
-              <w:jc w:val="left"/>
-            </w:pPr>
-            <w:r>
-              <w:t xml:space="preserve">Rect F1 / Boundary F1</w:t>
-            </w:r>
-          </w:p>
-        </w:tc>
-        <w:tc>
-          <w:tcPr>
-            <w:tcW w:w="6205" w:type="dxa"/>
-          </w:tcPr>
-          <w:p>
-            <w:pPr>
-              <w:pStyle w:val="Compact"/>
-              <w:jc w:val="left"/>
-            </w:pPr>
-            <w:r>
-              <w:t xml:space="preserve">待补</w:t>
+            <w:tcW w:w="2010" w:type="dxa"/>
+          </w:tcPr>
+          <w:p>
+            <w:pPr>
+              <w:pStyle w:val="Compact"/>
+              <w:jc w:val="left"/>
+            </w:pPr>
+            <w:r>
+              <w:t xml:space="preserve">解码</w:t>
+            </w:r>
+          </w:p>
+        </w:tc>
+        <w:tc>
+          <w:tcPr>
+            <w:tcW w:w="7628" w:type="dxa"/>
+          </w:tcPr>
+          <w:p>
+            <w:pPr>
+              <w:pStyle w:val="Compact"/>
+              <w:jc w:val="left"/>
+            </w:pPr>
+            <w:r>
+              <w:t xml:space="preserve">最优</w:t>
+            </w:r>
+            <w:r>
+              <w:t xml:space="preserve"> </w:t>
+            </w:r>
+            <w:r>
+              <w:rPr>
+                <w:rStyle w:val="VerbatimChar"/>
+              </w:rPr>
+              <w:t xml:space="preserve">min_block2/uniform</w:t>
+            </w:r>
+            <w:r>
+              <w:t xml:space="preserve">；阈值 14→0.55、17→0.60</w:t>
             </w:r>
           </w:p>
         </w:tc>
@@ -418,29 +489,153 @@
       <w:tr>
         <w:tc>
           <w:tcPr>
-            <w:tcW w:w="3433" w:type="dxa"/>
-          </w:tcPr>
-          <w:p>
-            <w:pPr>
-              <w:pStyle w:val="Compact"/>
-              <w:jc w:val="left"/>
-            </w:pPr>
-            <w:r>
-              <w:t xml:space="preserve">与 CNN 主线的差异</w:t>
-            </w:r>
-          </w:p>
-        </w:tc>
-        <w:tc>
-          <w:tcPr>
-            <w:tcW w:w="6205" w:type="dxa"/>
-          </w:tcPr>
-          <w:p>
-            <w:pPr>
-              <w:pStyle w:val="Compact"/>
-              <w:jc w:val="left"/>
-            </w:pPr>
-            <w:r>
-              <w:t xml:space="preserve">待补</w:t>
+            <w:tcW w:w="2010" w:type="dxa"/>
+          </w:tcPr>
+          <w:p>
+            <w:pPr>
+              <w:pStyle w:val="Compact"/>
+              <w:jc w:val="left"/>
+            </w:pPr>
+            <w:r>
+              <w:t xml:space="preserve">Test Exact（n=3968）</w:t>
+            </w:r>
+          </w:p>
+        </w:tc>
+        <w:tc>
+          <w:tcPr>
+            <w:tcW w:w="7628" w:type="dxa"/>
+          </w:tcPr>
+          <w:p>
+            <w:pPr>
+              <w:pStyle w:val="Compact"/>
+              <w:jc w:val="left"/>
+            </w:pPr>
+            <w:r>
+              <w:rPr>
+                <w:b/>
+                <w:bCs/>
+              </w:rPr>
+              <w:t xml:space="preserve">0.689</w:t>
+            </w:r>
+          </w:p>
+        </w:tc>
+      </w:tr>
+      <w:tr>
+        <w:tc>
+          <w:tcPr>
+            <w:tcW w:w="2010" w:type="dxa"/>
+          </w:tcPr>
+          <w:p>
+            <w:pPr>
+              <w:pStyle w:val="Compact"/>
+              <w:jc w:val="left"/>
+            </w:pPr>
+            <w:r>
+              <w:t xml:space="preserve">Rect F1 / Boundary F1</w:t>
+            </w:r>
+          </w:p>
+        </w:tc>
+        <w:tc>
+          <w:tcPr>
+            <w:tcW w:w="7628" w:type="dxa"/>
+          </w:tcPr>
+          <w:p>
+            <w:pPr>
+              <w:pStyle w:val="Compact"/>
+              <w:jc w:val="left"/>
+            </w:pPr>
+            <w:r>
+              <w:t xml:space="preserve">0.812 / 0.845</w:t>
+            </w:r>
+          </w:p>
+        </w:tc>
+      </w:tr>
+      <w:tr>
+        <w:tc>
+          <w:tcPr>
+            <w:tcW w:w="2010" w:type="dxa"/>
+          </w:tcPr>
+          <w:p>
+            <w:pPr>
+              <w:pStyle w:val="Compact"/>
+              <w:jc w:val="left"/>
+            </w:pPr>
+            <w:r>
+              <w:t xml:space="preserve">边界数 MAE</w:t>
+            </w:r>
+          </w:p>
+        </w:tc>
+        <w:tc>
+          <w:tcPr>
+            <w:tcW w:w="7628" w:type="dxa"/>
+          </w:tcPr>
+          <w:p>
+            <w:pPr>
+              <w:pStyle w:val="Compact"/>
+              <w:jc w:val="left"/>
+            </w:pPr>
+            <w:r>
+              <w:t xml:space="preserve">0.308（过分割 10.0% / 欠分割 14.9%）</w:t>
+            </w:r>
+          </w:p>
+        </w:tc>
+      </w:tr>
+      <w:tr>
+        <w:tc>
+          <w:tcPr>
+            <w:tcW w:w="2010" w:type="dxa"/>
+          </w:tcPr>
+          <w:p>
+            <w:pPr>
+              <w:pStyle w:val="Compact"/>
+              <w:jc w:val="left"/>
+            </w:pPr>
+            <w:r>
+              <w:t xml:space="preserve">未见尺寸 25（n=960）</w:t>
+            </w:r>
+          </w:p>
+        </w:tc>
+        <w:tc>
+          <w:tcPr>
+            <w:tcW w:w="7628" w:type="dxa"/>
+          </w:tcPr>
+          <w:p>
+            <w:pPr>
+              <w:pStyle w:val="Compact"/>
+              <w:jc w:val="left"/>
+            </w:pPr>
+            <w:r>
+              <w:t xml:space="preserve">Exact 0.577 / Rect F1 0.744 / Boundary F1 0.720</w:t>
+            </w:r>
+          </w:p>
+        </w:tc>
+      </w:tr>
+      <w:tr>
+        <w:tc>
+          <w:tcPr>
+            <w:tcW w:w="2010" w:type="dxa"/>
+          </w:tcPr>
+          <w:p>
+            <w:pPr>
+              <w:pStyle w:val="Compact"/>
+              <w:jc w:val="left"/>
+            </w:pPr>
+            <w:r>
+              <w:t xml:space="preserve">延迟（17×17）</w:t>
+            </w:r>
+          </w:p>
+        </w:tc>
+        <w:tc>
+          <w:tcPr>
+            <w:tcW w:w="7628" w:type="dxa"/>
+          </w:tcPr>
+          <w:p>
+            <w:pPr>
+              <w:pStyle w:val="Compact"/>
+              <w:jc w:val="left"/>
+            </w:pPr>
+            <w:r>
+              <w:t xml:space="preserve">单模型 0.11 ms · 3 模型集成 0.35 ms</w:t>
             </w:r>
           </w:p>
         </w:tc>
@@ -451,80 +646,144 @@
         <w:pStyle w:val="BodyText"/>
       </w:pPr>
       <w:r>
-        <w:t xml:space="preserve">填写约定：</w:t>
-      </w:r>
-    </w:p>
-    <w:p>
-      <w:pPr>
-        <w:pStyle w:val="Compact"/>
-        <w:numPr>
-          <w:ilvl w:val="0"/>
-          <w:numId w:val="1001"/>
-        </w:numPr>
-      </w:pPr>
-      <w:r>
-        <w:t xml:space="preserve">数值必须附</w:t>
+        <w:rPr>
+          <w:b/>
+          <w:bCs/>
+        </w:rPr>
+        <w:t xml:space="preserve">按视数的 Exact</w:t>
+      </w:r>
+      <w:r>
+        <w:t xml:space="preserve">（集成评估，n=640/视数）：L=9 → 32.3%，L=16 → 51.2%，L=25 → 66.5%，L=36 → 77.1%，L=49 → 85.4%，L=121 →</w:t>
       </w:r>
       <w:r>
         <w:t xml:space="preserve"> </w:t>
       </w:r>
       <w:r>
         <w:rPr>
+          <w:b/>
+          <w:bCs/>
+        </w:rPr>
+        <w:t xml:space="preserve">97.4%</w:t>
+      </w:r>
+      <w:r>
+        <w:t xml:space="preserve">。相干估计越稳，切分越准，单调上升。</w:t>
+      </w:r>
+    </w:p>
+    <w:p>
+      <w:pPr>
+        <w:pStyle w:val="BodyText"/>
+      </w:pPr>
+      <w:r>
+        <w:rPr>
+          <w:b/>
+          <w:bCs/>
+        </w:rPr>
+        <w:t xml:space="preserve">按最小块宽</w:t>
+      </w:r>
+      <w:r>
+        <w:t xml:space="preserve">（最优解码）：块宽 2 → 66.5%，3 → 70.0%，4 → 73.3%，5 → 66.3%，6 → 69.6%，7 → 67.5%，8 →</w:t>
+      </w:r>
+      <w:r>
+        <w:t xml:space="preserve"> </w:t>
+      </w:r>
+      <w:r>
+        <w:rPr>
+          <w:b/>
+          <w:bCs/>
+        </w:rPr>
+        <w:t xml:space="preserve">77.0%</w:t>
+      </w:r>
+      <w:r>
+        <w:t xml:space="preserve">。窄块（2–3）明显更难，块宽 5–7 反而回落，说明难点不只是「块小」，还有边界密度与块宽的耦合。</w:t>
+      </w:r>
+    </w:p>
+    <w:p>
+      <w:pPr>
+        <w:pStyle w:val="BodyText"/>
+      </w:pPr>
+      <w:r>
+        <w:rPr>
+          <w:b/>
+          <w:bCs/>
+        </w:rPr>
+        <w:t xml:space="preserve">按真实边界数</w:t>
+      </w:r>
+      <w:r>
+        <w:t xml:space="preserve">：1 → 69.6%，2 → 70.1%，3 → 61.8%，4 →</w:t>
+      </w:r>
+      <w:r>
+        <w:t xml:space="preserve"> </w:t>
+      </w:r>
+      <w:r>
+        <w:rPr>
+          <w:b/>
+          <w:bCs/>
+        </w:rPr>
+        <w:t xml:space="preserve">50.0%</w:t>
+      </w:r>
+      <w:r>
+        <w:t xml:space="preserve">。边界越多越难，4 边界时掉到随机水平附近。</w:t>
+      </w:r>
+    </w:p>
+    <w:p>
+      <w:pPr>
+        <w:pStyle w:val="BodyText"/>
+      </w:pPr>
+      <w:r>
+        <w:rPr>
+          <w:b/>
+          <w:bCs/>
+        </w:rPr>
+        <w:t xml:space="preserve">与 CNN 主线的差异</w:t>
+      </w:r>
+      <w:r>
+        <w:t xml:space="preserve">：本方案在</w:t>
+      </w:r>
+      <w:r>
+        <w:rPr>
+          <w:b/>
+          <w:bCs/>
+        </w:rPr>
+        <w:t xml:space="preserve">合成数据</w:t>
+      </w:r>
+      <w:r>
+        <w:t xml:space="preserve">上训练（可无限生成），CNN 主线在真实 2075 矩阵上训练；两者输出同为 N−1 边界向量，但数据分布不同，数字不可直接比较。待真实数据接入后才谈对齐。</w:t>
+      </w:r>
+    </w:p>
+    <w:p>
+      <w:pPr>
+        <w:pStyle w:val="BodyText"/>
+      </w:pPr>
+      <w:r>
+        <w:rPr>
+          <w:b/>
+          <w:bCs/>
+        </w:rPr>
+        <w:t xml:space="preserve">导出可视化</w:t>
+      </w:r>
+      <w:r>
+        <w:t xml:space="preserve">：</w:t>
+      </w:r>
+      <w:r>
+        <w:rPr>
           <w:rStyle w:val="VerbatimChar"/>
         </w:rPr>
-        <w:t xml:space="preserve">outputs/...</w:t>
+        <w:t xml:space="preserve">daninet/out/edge_segmentation/</w:t>
+      </w:r>
+      <w:r>
+        <w:t xml:space="preserve">（gallery.png、dataset_overview.png、36 张样本图，17×17，</w:t>
+      </w:r>
+      <w:r>
+        <w:rPr>
+          <w:rStyle w:val="VerbatimChar"/>
+        </w:rPr>
+        <w:t xml:space="preserve">summary.json</w:t>
       </w:r>
       <w:r>
         <w:t xml:space="preserve"> </w:t>
       </w:r>
       <w:r>
-        <w:t xml:space="preserve">下的 JSON 路径，格式与「四、对照表」一致。</w:t>
-      </w:r>
-    </w:p>
-    <w:p>
-      <w:pPr>
-        <w:pStyle w:val="Compact"/>
-        <w:numPr>
-          <w:ilvl w:val="0"/>
-          <w:numId w:val="1001"/>
-        </w:numPr>
-      </w:pPr>
-      <w:r>
-        <w:t xml:space="preserve">不确定的写「待补」，不要用估计值填表。</w:t>
-      </w:r>
-    </w:p>
-    <w:p>
-      <w:pPr>
-        <w:pStyle w:val="Compact"/>
-        <w:numPr>
-          <w:ilvl w:val="0"/>
-          <w:numId w:val="1001"/>
-        </w:numPr>
-      </w:pPr>
-      <w:r>
-        <w:t xml:space="preserve">补充后同步更新</w:t>
-      </w:r>
-      <w:r>
-        <w:t xml:space="preserve"> </w:t>
-      </w:r>
-      <w:r>
-        <w:rPr>
-          <w:rStyle w:val="VerbatimChar"/>
-        </w:rPr>
-        <w:t xml:space="preserve">docs/visual/</w:t>
-      </w:r>
-      <w:r>
-        <w:t xml:space="preserve"> </w:t>
-      </w:r>
-      <w:r>
-        <w:t xml:space="preserve">下对应可视化数据。</w:t>
-      </w:r>
-    </w:p>
-    <w:p>
-      <w:r>
-        <w:pict>
-          <v:rect style="width:0;height:1.5pt" o:hralign="center" o:hrstd="t" o:hr="t"/>
-        </w:pict>
+        <w:t xml:space="preserve">记录导出子集 Exact 0.660 / Rect 0.783）。</w:t>
       </w:r>
     </w:p>
     <w:bookmarkEnd w:id="20"/>
@@ -1160,11 +1419,60 @@
         <w:pStyle w:val="Compact"/>
         <w:numPr>
           <w:ilvl w:val="0"/>
-          <w:numId w:val="1002"/>
+          <w:numId w:val="1001"/>
         </w:numPr>
       </w:pPr>
       <w:r>
         <w:t xml:space="preserve">核：RBF-SVM；模型选择走验证集网格（C、γ）。</w:t>
+      </w:r>
+    </w:p>
+    <w:p>
+      <w:pPr>
+        <w:pStyle w:val="Compact"/>
+        <w:numPr>
+          <w:ilvl w:val="0"/>
+          <w:numId w:val="1001"/>
+        </w:numPr>
+      </w:pPr>
+      <w:r>
+        <w:t xml:space="preserve">阈值：按尺寸在验证集上分别校准；解码后经</w:t>
+      </w:r>
+      <w:r>
+        <w:t xml:space="preserve"> </w:t>
+      </w:r>
+      <w:r>
+        <w:rPr>
+          <w:rStyle w:val="VerbatimChar"/>
+        </w:rPr>
+        <w:t xml:space="preserve">rectangles_from_boundary</w:t>
+      </w:r>
+      <w:r>
+        <w:t xml:space="preserve"> </w:t>
+      </w:r>
+      <w:r>
+        <w:t xml:space="preserve">转成对角矩形。</w:t>
+      </w:r>
+    </w:p>
+    <w:p>
+      <w:pPr>
+        <w:pStyle w:val="Compact"/>
+        <w:numPr>
+          <w:ilvl w:val="0"/>
+          <w:numId w:val="1001"/>
+        </w:numPr>
+      </w:pPr>
+      <w:r>
+        <w:t xml:space="preserve">评估口径与 CNN 完全一致（见「五、术语与指标」）。</w:t>
+      </w:r>
+    </w:p>
+    <w:bookmarkEnd w:id="22"/>
+    <w:bookmarkStart w:id="23" w:name="X532ad1019dc9c63baad48b99609f23d8942d0c1"/>
+    <w:p>
+      <w:pPr>
+        <w:pStyle w:val="Heading3"/>
+      </w:pPr>
+      <w:r>
+        <w:t xml:space="preserve">2.3 局限与复现风险</w:t>
       </w:r>
     </w:p>
     <w:p>
@@ -1176,22 +1484,35 @@
         </w:numPr>
       </w:pPr>
       <w:r>
-        <w:t xml:space="preserve">阈值：按尺寸在验证集上分别校准；解码后经</w:t>
+        <w:t xml:space="preserve">当前工作树</w:t>
+      </w:r>
+      <w:r>
+        <w:rPr>
+          <w:b/>
+          <w:bCs/>
+        </w:rPr>
+        <w:t xml:space="preserve">没有</w:t>
       </w:r>
       <w:r>
         <w:t xml:space="preserve"> </w:t>
       </w:r>
       <w:r>
+        <w:t xml:space="preserve">SVM 源码与权重，只能从</w:t>
+      </w:r>
+      <w:r>
+        <w:t xml:space="preserve"> </w:t>
+      </w:r>
+      <w:r>
         <w:rPr>
           <w:rStyle w:val="VerbatimChar"/>
         </w:rPr>
-        <w:t xml:space="preserve">rectangles_from_boundary</w:t>
+        <w:t xml:space="preserve">1658ac7</w:t>
       </w:r>
       <w:r>
         <w:t xml:space="preserve"> </w:t>
       </w:r>
       <w:r>
-        <w:t xml:space="preserve">转成对角矩形。</w:t>
+        <w:t xml:space="preserve">用隔离 worktree 恢复。</w:t>
       </w:r>
     </w:p>
     <w:p>
@@ -1203,17 +1524,94 @@
         </w:numPr>
       </w:pPr>
       <w:r>
-        <w:t xml:space="preserve">评估口径与 CNN 完全一致（见「五、术语与指标」）。</w:t>
-      </w:r>
-    </w:p>
-    <w:bookmarkEnd w:id="22"/>
-    <w:bookmarkStart w:id="23" w:name="X532ad1019dc9c63baad48b99609f23d8942d0c1"/>
+        <w:t xml:space="preserve">矩阵级与边界级结果不可混用；历史报告里的两类数字分属不同任务。</w:t>
+      </w:r>
+    </w:p>
+    <w:p>
+      <w:pPr>
+        <w:pStyle w:val="Compact"/>
+        <w:numPr>
+          <w:ilvl w:val="0"/>
+          <w:numId w:val="1002"/>
+        </w:numPr>
+      </w:pPr>
+      <w:r>
+        <w:t xml:space="preserve">62 维特征依赖手工阈值与标准化参数，换数据分布需要重新校准。</w:t>
+      </w:r>
+    </w:p>
+    <w:p>
+      <w:pPr>
+        <w:pStyle w:val="Compact"/>
+        <w:numPr>
+          <w:ilvl w:val="0"/>
+          <w:numId w:val="1002"/>
+        </w:numPr>
+      </w:pPr>
+      <w:r>
+        <w:t xml:space="preserve">合成 SVM 的数据生成器与真实边界 SVM 不是同一套，指标不能横向拼表。</w:t>
+      </w:r>
+    </w:p>
+    <w:p>
+      <w:r>
+        <w:pict>
+          <v:rect style="width:0;height:1.5pt" o:hralign="center" o:hrstd="t" o:hr="t"/>
+        </w:pict>
+      </w:r>
+    </w:p>
+    <w:bookmarkEnd w:id="23"/>
+    <w:bookmarkEnd w:id="24"/>
+    <w:bookmarkStart w:id="31" w:name="三cnn-方案当前主线"/>
+    <w:p>
+      <w:pPr>
+        <w:pStyle w:val="Heading2"/>
+      </w:pPr>
+      <w:r>
+        <w:t xml:space="preserve">三、CNN 方案（当前主线）</w:t>
+      </w:r>
+    </w:p>
+    <w:bookmarkStart w:id="25" w:name="Xc343849a9980f7f3e107f4428d37039a7d02c90"/>
     <w:p>
       <w:pPr>
         <w:pStyle w:val="Heading3"/>
       </w:pPr>
       <w:r>
-        <w:t xml:space="preserve">2.3 局限与复现风险</w:t>
+        <w:t xml:space="preserve">3.1 问题形式化</w:t>
+      </w:r>
+    </w:p>
+    <w:p>
+      <w:pPr>
+        <w:pStyle w:val="FirstParagraph"/>
+      </w:pPr>
+      <w:r>
+        <w:t xml:space="preserve">输入 C ∈ ℝᴺˣᴺ（近似对称），输出候选边界向量 b ∈ {0,1}ᴺ⁻¹：位置 p 表示索引 p−1 与 p 之间是否发生块边界。边界集合排序后转成对角矩形 (qᵢ, qᵢ₊₁)²。二维块检测因此转成一维多标签边界检测。</w:t>
+      </w:r>
+    </w:p>
+    <w:bookmarkEnd w:id="25"/>
+    <w:bookmarkStart w:id="26" w:name="Xe128bdd1fcb6c748cb766c5899f21a0d216cfa6"/>
+    <w:p>
+      <w:pPr>
+        <w:pStyle w:val="Heading3"/>
+      </w:pPr>
+      <w:r>
+        <w:t xml:space="preserve">3.2 输入特征（5 通道）</w:t>
+      </w:r>
+    </w:p>
+    <w:p>
+      <w:pPr>
+        <w:pStyle w:val="FirstParagraph"/>
+      </w:pPr>
+      <w:r>
+        <w:t xml:space="preserve">原始矩阵、排除对角线后的矩阵内标准化、对称局部差分、前两个主特征向量绝对外积的谱先验——共 5 通道，按同尺寸 batch 组织。</w:t>
+      </w:r>
+    </w:p>
+    <w:bookmarkEnd w:id="26"/>
+    <w:bookmarkStart w:id="27" w:name="X781af762f0a86e141748c26c6360577001bcae7"/>
+    <w:p>
+      <w:pPr>
+        <w:pStyle w:val="Heading3"/>
+      </w:pPr>
+      <w:r>
+        <w:t xml:space="preserve">3.3 网络与损失</w:t>
       </w:r>
     </w:p>
     <w:p>
@@ -1225,35 +1623,14 @@
         </w:numPr>
       </w:pPr>
       <w:r>
-        <w:t xml:space="preserve">当前工作树</w:t>
-      </w:r>
-      <w:r>
         <w:rPr>
           <w:b/>
           <w:bCs/>
         </w:rPr>
-        <w:t xml:space="preserve">没有</w:t>
-      </w:r>
-      <w:r>
-        <w:t xml:space="preserve"> </w:t>
-      </w:r>
-      <w:r>
-        <w:t xml:space="preserve">SVM 源码与权重，只能从</w:t>
-      </w:r>
-      <w:r>
-        <w:t xml:space="preserve"> </w:t>
-      </w:r>
-      <w:r>
-        <w:rPr>
-          <w:rStyle w:val="VerbatimChar"/>
-        </w:rPr>
-        <w:t xml:space="preserve">1658ac7</w:t>
-      </w:r>
-      <w:r>
-        <w:t xml:space="preserve"> </w:t>
-      </w:r>
-      <w:r>
-        <w:t xml:space="preserve">用隔离 worktree 恢复。</w:t>
+        <w:t xml:space="preserve">骨干</w:t>
+      </w:r>
+      <w:r>
+        <w:t xml:space="preserve">：dilation 1/2/4 多尺度残差，宽度 32/64/128 三档；主头融合候选位置左右全局上下文；32/64 档另接深监督侧头。</w:t>
       </w:r>
     </w:p>
     <w:p>
@@ -1265,7 +1642,59 @@
         </w:numPr>
       </w:pPr>
       <w:r>
-        <w:t xml:space="preserve">矩阵级与边界级结果不可混用；历史报告里的两类数字分属不同任务。</w:t>
+        <w:rPr>
+          <w:b/>
+          <w:bCs/>
+        </w:rPr>
+        <w:t xml:space="preserve">损失</w:t>
+      </w:r>
+      <w:r>
+        <w:t xml:space="preserve">：Focal + Dice +</w:t>
+      </w:r>
+      <w:r>
+        <w:t xml:space="preserve"> </w:t>
+      </w:r>
+      <w:r>
+        <w:rPr>
+          <w:rStyle w:val="VerbatimChar"/>
+        </w:rPr>
+        <w:t xml:space="preserve">0.1</w:t>
+      </w:r>
+      <w:r>
+        <w:t xml:space="preserve"> </w:t>
+      </w:r>
+      <w:r>
+        <w:t xml:space="preserve">非对称边界数约束（欠/过分割 2:1）+</w:t>
+      </w:r>
+      <w:r>
+        <w:t xml:space="preserve"> </w:t>
+      </w:r>
+      <w:r>
+        <w:rPr>
+          <w:rStyle w:val="VerbatimChar"/>
+        </w:rPr>
+        <w:t xml:space="preserve">0.05</w:t>
+      </w:r>
+      <w:r>
+        <w:t xml:space="preserve"> </w:t>
+      </w:r>
+      <w:r>
+        <w:t xml:space="preserve">块一致性正则 +</w:t>
+      </w:r>
+      <w:r>
+        <w:t xml:space="preserve"> </w:t>
+      </w:r>
+      <w:r>
+        <w:rPr>
+          <w:rStyle w:val="VerbatimChar"/>
+        </w:rPr>
+        <w:t xml:space="preserve">0.5</w:t>
+      </w:r>
+      <w:r>
+        <w:t xml:space="preserve"> </w:t>
+      </w:r>
+      <w:r>
+        <w:t xml:space="preserve">subset（最差位置）损失。</w:t>
       </w:r>
     </w:p>
     <w:p>
@@ -1277,7 +1706,14 @@
         </w:numPr>
       </w:pPr>
       <w:r>
-        <w:t xml:space="preserve">62 维特征依赖手工阈值与标准化参数，换数据分布需要重新校准。</w:t>
+        <w:rPr>
+          <w:b/>
+          <w:bCs/>
+        </w:rPr>
+        <w:t xml:space="preserve">镜像等变正则</w:t>
+      </w:r>
+      <w:r>
+        <w:t xml:space="preserve">（默认 0.2）：z(C) ≈ reverse(z(flip(C)))，不依赖标签，降低随机种子方差。</w:t>
       </w:r>
     </w:p>
     <w:p>
@@ -1289,70 +1725,39 @@
         </w:numPr>
       </w:pPr>
       <w:r>
-        <w:t xml:space="preserve">合成 SVM 的数据生成器与真实边界 SVM 不是同一套，指标不能横向拼表。</w:t>
-      </w:r>
-    </w:p>
-    <w:p>
-      <w:r>
-        <w:pict>
-          <v:rect style="width:0;height:1.5pt" o:hralign="center" o:hrstd="t" o:hr="t"/>
-        </w:pict>
-      </w:r>
-    </w:p>
-    <w:bookmarkEnd w:id="23"/>
-    <w:bookmarkEnd w:id="24"/>
-    <w:bookmarkStart w:id="31" w:name="三cnn-方案当前主线"/>
-    <w:p>
-      <w:pPr>
-        <w:pStyle w:val="Heading2"/>
-      </w:pPr>
-      <w:r>
-        <w:t xml:space="preserve">三、CNN 方案（当前主线）</w:t>
-      </w:r>
-    </w:p>
-    <w:bookmarkStart w:id="25" w:name="Xc343849a9980f7f3e107f4428d37039a7d02c90"/>
+        <w:rPr>
+          <w:b/>
+          <w:bCs/>
+        </w:rPr>
+        <w:t xml:space="preserve">可选两阶段</w:t>
+      </w:r>
+      <w:r>
+        <w:t xml:space="preserve">：先用全部 2075 个矩阵做掩码重建预训练，再</w:t>
+      </w:r>
+      <w:r>
+        <w:t xml:space="preserve"> </w:t>
+      </w:r>
+      <w:r>
+        <w:rPr>
+          <w:rStyle w:val="VerbatimChar"/>
+        </w:rPr>
+        <w:t xml:space="preserve">--init-checkpoint</w:t>
+      </w:r>
+      <w:r>
+        <w:t xml:space="preserve"> </w:t>
+      </w:r>
+      <w:r>
+        <w:t xml:space="preserve">微调。</w:t>
+      </w:r>
+    </w:p>
+    <w:bookmarkEnd w:id="27"/>
+    <w:bookmarkStart w:id="28" w:name="X86ae28ff69a6f54fec2d39483af50ccc8de793a"/>
     <w:p>
       <w:pPr>
         <w:pStyle w:val="Heading3"/>
       </w:pPr>
       <w:r>
-        <w:t xml:space="preserve">3.1 问题形式化</w:t>
-      </w:r>
-    </w:p>
-    <w:p>
-      <w:pPr>
-        <w:pStyle w:val="FirstParagraph"/>
-      </w:pPr>
-      <w:r>
-        <w:t xml:space="preserve">输入 C ∈ ℝᴺˣᴺ（近似对称），输出候选边界向量 b ∈ {0,1}ᴺ⁻¹：位置 p 表示索引 p−1 与 p 之间是否发生块边界。边界集合排序后转成对角矩形 (qᵢ, qᵢ₊₁)²。二维块检测因此转成一维多标签边界检测。</w:t>
-      </w:r>
-    </w:p>
-    <w:bookmarkEnd w:id="25"/>
-    <w:bookmarkStart w:id="26" w:name="Xe128bdd1fcb6c748cb766c5899f21a0d216cfa6"/>
-    <w:p>
-      <w:pPr>
-        <w:pStyle w:val="Heading3"/>
-      </w:pPr>
-      <w:r>
-        <w:t xml:space="preserve">3.2 输入特征（5 通道）</w:t>
-      </w:r>
-    </w:p>
-    <w:p>
-      <w:pPr>
-        <w:pStyle w:val="FirstParagraph"/>
-      </w:pPr>
-      <w:r>
-        <w:t xml:space="preserve">原始矩阵、排除对角线后的矩阵内标准化、对称局部差分、前两个主特征向量绝对外积的谱先验——共 5 通道，按同尺寸 batch 组织。</w:t>
-      </w:r>
-    </w:p>
-    <w:bookmarkEnd w:id="26"/>
-    <w:bookmarkStart w:id="27" w:name="X781af762f0a86e141748c26c6360577001bcae7"/>
-    <w:p>
-      <w:pPr>
-        <w:pStyle w:val="Heading3"/>
-      </w:pPr>
-      <w:r>
-        <w:t xml:space="preserve">3.3 网络与损失</w:t>
+        <w:t xml:space="preserve">3.4 数据与评估</w:t>
       </w:r>
     </w:p>
     <w:p>
@@ -1364,14 +1769,17 @@
         </w:numPr>
       </w:pPr>
       <w:r>
+        <w:t xml:space="preserve">2075 个真实矩阵，按</w:t>
+      </w:r>
+      <w:r>
         <w:rPr>
           <w:b/>
           <w:bCs/>
         </w:rPr>
-        <w:t xml:space="preserve">骨干</w:t>
-      </w:r>
-      <w:r>
-        <w:t xml:space="preserve">：dilation 1/2/4 多尺度残差，宽度 32/64/128 三档；主头融合候选位置左右全局上下文；32/64 档另接深监督侧头。</w:t>
+        <w:t xml:space="preserve">来源目录隔离</w:t>
+      </w:r>
+      <w:r>
+        <w:t xml:space="preserve">切成 76% / 10% / 14%（训练 767 / 验证 104 / 测试 140）；划分种子与训练种子解耦。</w:t>
       </w:r>
     </w:p>
     <w:p>
@@ -1383,59 +1791,7 @@
         </w:numPr>
       </w:pPr>
       <w:r>
-        <w:rPr>
-          <w:b/>
-          <w:bCs/>
-        </w:rPr>
-        <w:t xml:space="preserve">损失</w:t>
-      </w:r>
-      <w:r>
-        <w:t xml:space="preserve">：Focal + Dice +</w:t>
-      </w:r>
-      <w:r>
-        <w:t xml:space="preserve"> </w:t>
-      </w:r>
-      <w:r>
-        <w:rPr>
-          <w:rStyle w:val="VerbatimChar"/>
-        </w:rPr>
-        <w:t xml:space="preserve">0.1</w:t>
-      </w:r>
-      <w:r>
-        <w:t xml:space="preserve"> </w:t>
-      </w:r>
-      <w:r>
-        <w:t xml:space="preserve">非对称边界数约束（欠/过分割 2:1）+</w:t>
-      </w:r>
-      <w:r>
-        <w:t xml:space="preserve"> </w:t>
-      </w:r>
-      <w:r>
-        <w:rPr>
-          <w:rStyle w:val="VerbatimChar"/>
-        </w:rPr>
-        <w:t xml:space="preserve">0.05</w:t>
-      </w:r>
-      <w:r>
-        <w:t xml:space="preserve"> </w:t>
-      </w:r>
-      <w:r>
-        <w:t xml:space="preserve">块一致性正则 +</w:t>
-      </w:r>
-      <w:r>
-        <w:t xml:space="preserve"> </w:t>
-      </w:r>
-      <w:r>
-        <w:rPr>
-          <w:rStyle w:val="VerbatimChar"/>
-        </w:rPr>
-        <w:t xml:space="preserve">0.5</w:t>
-      </w:r>
-      <w:r>
-        <w:t xml:space="preserve"> </w:t>
-      </w:r>
-      <w:r>
-        <w:t xml:space="preserve">subset（最差位置）损失。</w:t>
+        <w:t xml:space="preserve">尺寸范围：当前只用 14×14、17×17，默认排除 32×32；训练中两尺寸等量 batch。</w:t>
       </w:r>
     </w:p>
     <w:p>
@@ -1447,14 +1803,17 @@
         </w:numPr>
       </w:pPr>
       <w:r>
+        <w:t xml:space="preserve">模型选择：验证集</w:t>
+      </w:r>
+      <w:r>
         <w:rPr>
           <w:b/>
           <w:bCs/>
         </w:rPr>
-        <w:t xml:space="preserve">镜像等变正则</w:t>
-      </w:r>
-      <w:r>
-        <w:t xml:space="preserve">（默认 0.2）：z(C) ≈ reverse(z(flip(C)))，不依赖标签，降低随机种子方差。</w:t>
+        <w:t xml:space="preserve">分尺寸宏平均 Rect F1</w:t>
+      </w:r>
+      <w:r>
+        <w:t xml:space="preserve">；阈值按尺寸校准（单模型 14→0.55、17→0.65；集成另行校准）。</w:t>
       </w:r>
     </w:p>
     <w:p>
@@ -1463,106 +1822,6 @@
         <w:numPr>
           <w:ilvl w:val="0"/>
           <w:numId w:val="1004"/>
-        </w:numPr>
-      </w:pPr>
-      <w:r>
-        <w:rPr>
-          <w:b/>
-          <w:bCs/>
-        </w:rPr>
-        <w:t xml:space="preserve">可选两阶段</w:t>
-      </w:r>
-      <w:r>
-        <w:t xml:space="preserve">：先用全部 2075 个矩阵做掩码重建预训练，再</w:t>
-      </w:r>
-      <w:r>
-        <w:t xml:space="preserve"> </w:t>
-      </w:r>
-      <w:r>
-        <w:rPr>
-          <w:rStyle w:val="VerbatimChar"/>
-        </w:rPr>
-        <w:t xml:space="preserve">--init-checkpoint</w:t>
-      </w:r>
-      <w:r>
-        <w:t xml:space="preserve"> </w:t>
-      </w:r>
-      <w:r>
-        <w:t xml:space="preserve">微调。</w:t>
-      </w:r>
-    </w:p>
-    <w:bookmarkEnd w:id="27"/>
-    <w:bookmarkStart w:id="28" w:name="X86ae28ff69a6f54fec2d39483af50ccc8de793a"/>
-    <w:p>
-      <w:pPr>
-        <w:pStyle w:val="Heading3"/>
-      </w:pPr>
-      <w:r>
-        <w:t xml:space="preserve">3.4 数据与评估</w:t>
-      </w:r>
-    </w:p>
-    <w:p>
-      <w:pPr>
-        <w:pStyle w:val="Compact"/>
-        <w:numPr>
-          <w:ilvl w:val="0"/>
-          <w:numId w:val="1005"/>
-        </w:numPr>
-      </w:pPr>
-      <w:r>
-        <w:t xml:space="preserve">2075 个真实矩阵，按</w:t>
-      </w:r>
-      <w:r>
-        <w:rPr>
-          <w:b/>
-          <w:bCs/>
-        </w:rPr>
-        <w:t xml:space="preserve">来源目录隔离</w:t>
-      </w:r>
-      <w:r>
-        <w:t xml:space="preserve">切成 76% / 10% / 14%（训练 767 / 验证 104 / 测试 140）；划分种子与训练种子解耦。</w:t>
-      </w:r>
-    </w:p>
-    <w:p>
-      <w:pPr>
-        <w:pStyle w:val="Compact"/>
-        <w:numPr>
-          <w:ilvl w:val="0"/>
-          <w:numId w:val="1005"/>
-        </w:numPr>
-      </w:pPr>
-      <w:r>
-        <w:t xml:space="preserve">尺寸范围：当前只用 14×14、17×17，默认排除 32×32；训练中两尺寸等量 batch。</w:t>
-      </w:r>
-    </w:p>
-    <w:p>
-      <w:pPr>
-        <w:pStyle w:val="Compact"/>
-        <w:numPr>
-          <w:ilvl w:val="0"/>
-          <w:numId w:val="1005"/>
-        </w:numPr>
-      </w:pPr>
-      <w:r>
-        <w:t xml:space="preserve">模型选择：验证集</w:t>
-      </w:r>
-      <w:r>
-        <w:rPr>
-          <w:b/>
-          <w:bCs/>
-        </w:rPr>
-        <w:t xml:space="preserve">分尺寸宏平均 Rect F1</w:t>
-      </w:r>
-      <w:r>
-        <w:t xml:space="preserve">；阈值按尺寸校准（单模型 14→0.55、17→0.65；集成另行校准）。</w:t>
-      </w:r>
-    </w:p>
-    <w:p>
-      <w:pPr>
-        <w:pStyle w:val="Compact"/>
-        <w:numPr>
-          <w:ilvl w:val="0"/>
-          <w:numId w:val="1005"/>
         </w:numPr>
       </w:pPr>
       <w:r>
@@ -2049,10 +2308,10 @@
         <w:tblLook w:firstRow="1" w:lastRow="0" w:firstColumn="0" w:lastColumn="0" w:noHBand="0" w:noVBand="0" w:val="0020"/>
       </w:tblPr>
       <w:tblGrid>
-        <w:gridCol w:w="1608"/>
-        <w:gridCol w:w="3106"/>
-        <w:gridCol w:w="2618"/>
-        <w:gridCol w:w="2306"/>
+        <w:gridCol w:w="1165"/>
+        <w:gridCol w:w="2713"/>
+        <w:gridCol w:w="2936"/>
+        <w:gridCol w:w="2824"/>
       </w:tblGrid>
       <w:tr>
         <w:trPr>
@@ -2060,7 +2319,7 @@
         </w:trPr>
         <w:tc>
           <w:tcPr>
-            <w:tcW w:w="1608" w:type="dxa"/>
+            <w:tcW w:w="1165" w:type="dxa"/>
           </w:tcPr>
           <w:p>
             <w:pPr>
@@ -2074,7 +2333,7 @@
         </w:tc>
         <w:tc>
           <w:tcPr>
-            <w:tcW w:w="3106" w:type="dxa"/>
+            <w:tcW w:w="2713" w:type="dxa"/>
           </w:tcPr>
           <w:p>
             <w:pPr>
@@ -2088,7 +2347,7 @@
         </w:tc>
         <w:tc>
           <w:tcPr>
-            <w:tcW w:w="2618" w:type="dxa"/>
+            <w:tcW w:w="2936" w:type="dxa"/>
           </w:tcPr>
           <w:p>
             <w:pPr>
@@ -2102,7 +2361,7 @@
         </w:tc>
         <w:tc>
           <w:tcPr>
-            <w:tcW w:w="2306" w:type="dxa"/>
+            <w:tcW w:w="2824" w:type="dxa"/>
           </w:tcPr>
           <w:p>
             <w:pPr>
@@ -2118,7 +2377,7 @@
       <w:tr>
         <w:tc>
           <w:tcPr>
-            <w:tcW w:w="1608" w:type="dxa"/>
+            <w:tcW w:w="1165" w:type="dxa"/>
           </w:tcPr>
           <w:p>
             <w:pPr>
@@ -2132,7 +2391,7 @@
         </w:tc>
         <w:tc>
           <w:tcPr>
-            <w:tcW w:w="3106" w:type="dxa"/>
+            <w:tcW w:w="2713" w:type="dxa"/>
           </w:tcPr>
           <w:p>
             <w:pPr>
@@ -2146,7 +2405,7 @@
         </w:tc>
         <w:tc>
           <w:tcPr>
-            <w:tcW w:w="2618" w:type="dxa"/>
+            <w:tcW w:w="2936" w:type="dxa"/>
           </w:tcPr>
           <w:p>
             <w:pPr>
@@ -2160,15 +2419,15 @@
         </w:tc>
         <w:tc>
           <w:tcPr>
-            <w:tcW w:w="2306" w:type="dxa"/>
-          </w:tcPr>
-          <w:p>
-            <w:pPr>
-              <w:pStyle w:val="Compact"/>
-              <w:jc w:val="left"/>
-            </w:pPr>
-            <w:r>
-              <w:t xml:space="preserve">待补</w:t>
+            <w:tcW w:w="2824" w:type="dxa"/>
+          </w:tcPr>
+          <w:p>
+            <w:pPr>
+              <w:pStyle w:val="Compact"/>
+              <w:jc w:val="left"/>
+            </w:pPr>
+            <w:r>
+              <w:t xml:space="preserve">逐候选边界 N−1</w:t>
             </w:r>
           </w:p>
         </w:tc>
@@ -2176,7 +2435,7 @@
       <w:tr>
         <w:tc>
           <w:tcPr>
-            <w:tcW w:w="1608" w:type="dxa"/>
+            <w:tcW w:w="1165" w:type="dxa"/>
           </w:tcPr>
           <w:p>
             <w:pPr>
@@ -2190,7 +2449,7 @@
         </w:tc>
         <w:tc>
           <w:tcPr>
-            <w:tcW w:w="3106" w:type="dxa"/>
+            <w:tcW w:w="2713" w:type="dxa"/>
           </w:tcPr>
           <w:p>
             <w:pPr>
@@ -2204,7 +2463,7 @@
         </w:tc>
         <w:tc>
           <w:tcPr>
-            <w:tcW w:w="2618" w:type="dxa"/>
+            <w:tcW w:w="2936" w:type="dxa"/>
           </w:tcPr>
           <w:p>
             <w:pPr>
@@ -2218,15 +2477,15 @@
         </w:tc>
         <w:tc>
           <w:tcPr>
-            <w:tcW w:w="2306" w:type="dxa"/>
-          </w:tcPr>
-          <w:p>
-            <w:pPr>
-              <w:pStyle w:val="Compact"/>
-              <w:jc w:val="left"/>
-            </w:pPr>
-            <w:r>
-              <w:t xml:space="preserve">待补</w:t>
+            <w:tcW w:w="2824" w:type="dxa"/>
+          </w:tcPr>
+          <w:p>
+            <w:pPr>
+              <w:pStyle w:val="Compact"/>
+              <w:jc w:val="left"/>
+            </w:pPr>
+            <w:r>
+              <w:t xml:space="preserve">5 通道 normalized_gradient_svd</w:t>
             </w:r>
           </w:p>
         </w:tc>
@@ -2234,7 +2493,7 @@
       <w:tr>
         <w:tc>
           <w:tcPr>
-            <w:tcW w:w="1608" w:type="dxa"/>
+            <w:tcW w:w="1165" w:type="dxa"/>
           </w:tcPr>
           <w:p>
             <w:pPr>
@@ -2248,7 +2507,7 @@
         </w:tc>
         <w:tc>
           <w:tcPr>
-            <w:tcW w:w="3106" w:type="dxa"/>
+            <w:tcW w:w="2713" w:type="dxa"/>
           </w:tcPr>
           <w:p>
             <w:pPr>
@@ -2262,7 +2521,7 @@
         </w:tc>
         <w:tc>
           <w:tcPr>
-            <w:tcW w:w="2618" w:type="dxa"/>
+            <w:tcW w:w="2936" w:type="dxa"/>
           </w:tcPr>
           <w:p>
             <w:pPr>
@@ -2276,15 +2535,15 @@
         </w:tc>
         <w:tc>
           <w:tcPr>
-            <w:tcW w:w="2306" w:type="dxa"/>
-          </w:tcPr>
-          <w:p>
-            <w:pPr>
-              <w:pStyle w:val="Compact"/>
-              <w:jc w:val="left"/>
-            </w:pPr>
-            <w:r>
-              <w:t xml:space="preserve">待补</w:t>
+            <w:tcW w:w="2824" w:type="dxa"/>
+          </w:tcPr>
+          <w:p>
+            <w:pPr>
+              <w:pStyle w:val="Compact"/>
+              <w:jc w:val="left"/>
+            </w:pPr>
+            <w:r>
+              <w:t xml:space="preserve">多尺度残差 + 深监督侧头</w:t>
             </w:r>
           </w:p>
         </w:tc>
@@ -2292,7 +2551,7 @@
       <w:tr>
         <w:tc>
           <w:tcPr>
-            <w:tcW w:w="1608" w:type="dxa"/>
+            <w:tcW w:w="1165" w:type="dxa"/>
           </w:tcPr>
           <w:p>
             <w:pPr>
@@ -2306,7 +2565,7 @@
         </w:tc>
         <w:tc>
           <w:tcPr>
-            <w:tcW w:w="3106" w:type="dxa"/>
+            <w:tcW w:w="2713" w:type="dxa"/>
           </w:tcPr>
           <w:p>
             <w:pPr>
@@ -2320,7 +2579,7 @@
         </w:tc>
         <w:tc>
           <w:tcPr>
-            <w:tcW w:w="2618" w:type="dxa"/>
+            <w:tcW w:w="2936" w:type="dxa"/>
           </w:tcPr>
           <w:p>
             <w:pPr>
@@ -2334,7 +2593,7 @@
         </w:tc>
         <w:tc>
           <w:tcPr>
-            <w:tcW w:w="2306" w:type="dxa"/>
+            <w:tcW w:w="2824" w:type="dxa"/>
           </w:tcPr>
           <w:p>
             <w:pPr>
@@ -2350,7 +2609,7 @@
       <w:tr>
         <w:tc>
           <w:tcPr>
-            <w:tcW w:w="1608" w:type="dxa"/>
+            <w:tcW w:w="1165" w:type="dxa"/>
           </w:tcPr>
           <w:p>
             <w:pPr>
@@ -2364,7 +2623,7 @@
         </w:tc>
         <w:tc>
           <w:tcPr>
-            <w:tcW w:w="3106" w:type="dxa"/>
+            <w:tcW w:w="2713" w:type="dxa"/>
           </w:tcPr>
           <w:p>
             <w:pPr>
@@ -2378,29 +2637,29 @@
         </w:tc>
         <w:tc>
           <w:tcPr>
-            <w:tcW w:w="2618" w:type="dxa"/>
-          </w:tcPr>
-          <w:p>
-            <w:pPr>
-              <w:pStyle w:val="Compact"/>
-              <w:jc w:val="left"/>
-            </w:pPr>
-            <w:r>
-              <w:t xml:space="preserve">0.6929（单模型）</w:t>
-            </w:r>
-          </w:p>
-        </w:tc>
-        <w:tc>
-          <w:tcPr>
-            <w:tcW w:w="2306" w:type="dxa"/>
-          </w:tcPr>
-          <w:p>
-            <w:pPr>
-              <w:pStyle w:val="Compact"/>
-              <w:jc w:val="left"/>
-            </w:pPr>
-            <w:r>
-              <w:t xml:space="preserve">待补</w:t>
+            <w:tcW w:w="2936" w:type="dxa"/>
+          </w:tcPr>
+          <w:p>
+            <w:pPr>
+              <w:pStyle w:val="Compact"/>
+              <w:jc w:val="left"/>
+            </w:pPr>
+            <w:r>
+              <w:t xml:space="preserve">0.6929（真实数据单模型）</w:t>
+            </w:r>
+          </w:p>
+        </w:tc>
+        <w:tc>
+          <w:tcPr>
+            <w:tcW w:w="2824" w:type="dxa"/>
+          </w:tcPr>
+          <w:p>
+            <w:pPr>
+              <w:pStyle w:val="Compact"/>
+              <w:jc w:val="left"/>
+            </w:pPr>
+            <w:r>
+              <w:t xml:space="preserve">0.689（合成数据集成）</w:t>
             </w:r>
           </w:p>
         </w:tc>
@@ -2408,7 +2667,7 @@
       <w:tr>
         <w:tc>
           <w:tcPr>
-            <w:tcW w:w="1608" w:type="dxa"/>
+            <w:tcW w:w="1165" w:type="dxa"/>
           </w:tcPr>
           <w:p>
             <w:pPr>
@@ -2422,7 +2681,7 @@
         </w:tc>
         <w:tc>
           <w:tcPr>
-            <w:tcW w:w="3106" w:type="dxa"/>
+            <w:tcW w:w="2713" w:type="dxa"/>
           </w:tcPr>
           <w:p>
             <w:pPr>
@@ -2436,7 +2695,7 @@
         </w:tc>
         <w:tc>
           <w:tcPr>
-            <w:tcW w:w="2618" w:type="dxa"/>
+            <w:tcW w:w="2936" w:type="dxa"/>
           </w:tcPr>
           <w:p>
             <w:pPr>
@@ -2456,7 +2715,7 @@
         </w:tc>
         <w:tc>
           <w:tcPr>
-            <w:tcW w:w="2306" w:type="dxa"/>
+            <w:tcW w:w="2824" w:type="dxa"/>
           </w:tcPr>
           <w:p>
             <w:pPr>
@@ -2472,7 +2731,7 @@
       <w:tr>
         <w:tc>
           <w:tcPr>
-            <w:tcW w:w="1608" w:type="dxa"/>
+            <w:tcW w:w="1165" w:type="dxa"/>
           </w:tcPr>
           <w:p>
             <w:pPr>
@@ -2486,7 +2745,7 @@
         </w:tc>
         <w:tc>
           <w:tcPr>
-            <w:tcW w:w="3106" w:type="dxa"/>
+            <w:tcW w:w="2713" w:type="dxa"/>
           </w:tcPr>
           <w:p>
             <w:pPr>
@@ -2515,7 +2774,7 @@
         </w:tc>
         <w:tc>
           <w:tcPr>
-            <w:tcW w:w="2618" w:type="dxa"/>
+            <w:tcW w:w="2936" w:type="dxa"/>
           </w:tcPr>
           <w:p>
             <w:pPr>
@@ -2529,15 +2788,15 @@
         </w:tc>
         <w:tc>
           <w:tcPr>
-            <w:tcW w:w="2306" w:type="dxa"/>
-          </w:tcPr>
-          <w:p>
-            <w:pPr>
-              <w:pStyle w:val="Compact"/>
-              <w:jc w:val="left"/>
-            </w:pPr>
-            <w:r>
-              <w:t xml:space="preserve">未开始</w:t>
+            <w:tcW w:w="2824" w:type="dxa"/>
+          </w:tcPr>
+          <w:p>
+            <w:pPr>
+              <w:pStyle w:val="Compact"/>
+              <w:jc w:val="left"/>
+            </w:pPr>
+            <w:r>
+              <w:t xml:space="preserve">权重与评估 JSON 齐全（合成数据）</w:t>
             </w:r>
           </w:p>
         </w:tc>
@@ -2867,7 +3126,7 @@
         <w:pStyle w:val="Compact"/>
         <w:numPr>
           <w:ilvl w:val="0"/>
-          <w:numId w:val="1006"/>
+          <w:numId w:val="1005"/>
         </w:numPr>
       </w:pPr>
       <w:r>
@@ -2881,7 +3140,19 @@
         <w:t xml:space="preserve">daninet 段</w:t>
       </w:r>
       <w:r>
-        <w:t xml:space="preserve">（第一节）在新模型落地后由训练者填写。</w:t>
+        <w:t xml:space="preserve">（第一节）由训练侧填写，新 run 落地后同步</w:t>
+      </w:r>
+      <w:r>
+        <w:t xml:space="preserve"> </w:t>
+      </w:r>
+      <w:r>
+        <w:rPr>
+          <w:rStyle w:val="VerbatimChar"/>
+        </w:rPr>
+        <w:t xml:space="preserve">docs/visual/segmentation/edge.json</w:t>
+      </w:r>
+      <w:r>
+        <w:t xml:space="preserve">。</w:t>
       </w:r>
     </w:p>
     <w:p>
@@ -2889,7 +3160,7 @@
         <w:pStyle w:val="Compact"/>
         <w:numPr>
           <w:ilvl w:val="0"/>
-          <w:numId w:val="1006"/>
+          <w:numId w:val="1005"/>
         </w:numPr>
       </w:pPr>
       <w:r>
@@ -2925,7 +3196,7 @@
         <w:pStyle w:val="Compact"/>
         <w:numPr>
           <w:ilvl w:val="0"/>
-          <w:numId w:val="1006"/>
+          <w:numId w:val="1005"/>
         </w:numPr>
       </w:pPr>
       <w:r>
@@ -3068,6 +3339,82 @@
       </w:pPr>
     </w:lvl>
   </w:abstractNum>
+  <w:abstractNum w:abstractNumId="991">
+    <w:nsid w:val="0000A991"/>
+    <w:multiLevelType w:val="multilevel"/>
+    <w:lvl w:ilvl="0">
+      <w:numFmt w:val="bullet"/>
+      <w:lvlText w:val="•"/>
+      <w:lvlJc w:val="left"/>
+      <w:pPr>
+        <w:ind w:left="720" w:hanging="480"/>
+      </w:pPr>
+    </w:lvl>
+    <w:lvl w:ilvl="1">
+      <w:numFmt w:val="bullet"/>
+      <w:lvlText w:val="–"/>
+      <w:lvlJc w:val="left"/>
+      <w:pPr>
+        <w:ind w:left="1440" w:hanging="480"/>
+      </w:pPr>
+    </w:lvl>
+    <w:lvl w:ilvl="2">
+      <w:numFmt w:val="bullet"/>
+      <w:lvlText w:val="•"/>
+      <w:lvlJc w:val="left"/>
+      <w:pPr>
+        <w:ind w:left="2160" w:hanging="480"/>
+      </w:pPr>
+    </w:lvl>
+    <w:lvl w:ilvl="3">
+      <w:numFmt w:val="bullet"/>
+      <w:lvlText w:val="–"/>
+      <w:lvlJc w:val="left"/>
+      <w:pPr>
+        <w:ind w:left="2880" w:hanging="480"/>
+      </w:pPr>
+    </w:lvl>
+    <w:lvl w:ilvl="4">
+      <w:numFmt w:val="bullet"/>
+      <w:lvlText w:val="•"/>
+      <w:lvlJc w:val="left"/>
+      <w:pPr>
+        <w:ind w:left="3600" w:hanging="480"/>
+      </w:pPr>
+    </w:lvl>
+    <w:lvl w:ilvl="5">
+      <w:numFmt w:val="bullet"/>
+      <w:lvlText w:val="–"/>
+      <w:lvlJc w:val="left"/>
+      <w:pPr>
+        <w:ind w:left="4320" w:hanging="480"/>
+      </w:pPr>
+    </w:lvl>
+    <w:lvl w:ilvl="6">
+      <w:numFmt w:val="bullet"/>
+      <w:lvlText w:val="•"/>
+      <w:lvlJc w:val="left"/>
+      <w:pPr>
+        <w:ind w:left="5040" w:hanging="480"/>
+      </w:pPr>
+    </w:lvl>
+    <w:lvl w:ilvl="7">
+      <w:numFmt w:val="bullet"/>
+      <w:lvlText w:val="–"/>
+      <w:lvlJc w:val="left"/>
+      <w:pPr>
+        <w:ind w:left="5760" w:hanging="480"/>
+      </w:pPr>
+    </w:lvl>
+    <w:lvl w:ilvl="8">
+      <w:numFmt w:val="bullet"/>
+      <w:lvlText w:val="•"/>
+      <w:lvlJc w:val="left"/>
+      <w:pPr>
+        <w:ind w:left="6480" w:hanging="480"/>
+      </w:pPr>
+    </w:lvl>
+  </w:abstractNum>
   <w:abstractNum w:abstractNumId="99411">
     <w:nsid w:val="00A99411"/>
     <w:multiLevelType w:val="multilevel"/>
@@ -3153,86 +3500,13 @@
       </w:pPr>
     </w:lvl>
   </w:abstractNum>
-  <w:abstractNum w:abstractNumId="991">
-    <w:nsid w:val="0000A991"/>
-    <w:multiLevelType w:val="multilevel"/>
-    <w:lvl w:ilvl="0">
-      <w:numFmt w:val="bullet"/>
-      <w:lvlText w:val="•"/>
-      <w:lvlJc w:val="left"/>
-      <w:pPr>
-        <w:ind w:left="720" w:hanging="480"/>
-      </w:pPr>
-    </w:lvl>
-    <w:lvl w:ilvl="1">
-      <w:numFmt w:val="bullet"/>
-      <w:lvlText w:val="–"/>
-      <w:lvlJc w:val="left"/>
-      <w:pPr>
-        <w:ind w:left="1440" w:hanging="480"/>
-      </w:pPr>
-    </w:lvl>
-    <w:lvl w:ilvl="2">
-      <w:numFmt w:val="bullet"/>
-      <w:lvlText w:val="•"/>
-      <w:lvlJc w:val="left"/>
-      <w:pPr>
-        <w:ind w:left="2160" w:hanging="480"/>
-      </w:pPr>
-    </w:lvl>
-    <w:lvl w:ilvl="3">
-      <w:numFmt w:val="bullet"/>
-      <w:lvlText w:val="–"/>
-      <w:lvlJc w:val="left"/>
-      <w:pPr>
-        <w:ind w:left="2880" w:hanging="480"/>
-      </w:pPr>
-    </w:lvl>
-    <w:lvl w:ilvl="4">
-      <w:numFmt w:val="bullet"/>
-      <w:lvlText w:val="•"/>
-      <w:lvlJc w:val="left"/>
-      <w:pPr>
-        <w:ind w:left="3600" w:hanging="480"/>
-      </w:pPr>
-    </w:lvl>
-    <w:lvl w:ilvl="5">
-      <w:numFmt w:val="bullet"/>
-      <w:lvlText w:val="–"/>
-      <w:lvlJc w:val="left"/>
-      <w:pPr>
-        <w:ind w:left="4320" w:hanging="480"/>
-      </w:pPr>
-    </w:lvl>
-    <w:lvl w:ilvl="6">
-      <w:numFmt w:val="bullet"/>
-      <w:lvlText w:val="•"/>
-      <w:lvlJc w:val="left"/>
-      <w:pPr>
-        <w:ind w:left="5040" w:hanging="480"/>
-      </w:pPr>
-    </w:lvl>
-    <w:lvl w:ilvl="7">
-      <w:numFmt w:val="bullet"/>
-      <w:lvlText w:val="–"/>
-      <w:lvlJc w:val="left"/>
-      <w:pPr>
-        <w:ind w:left="5760" w:hanging="480"/>
-      </w:pPr>
-    </w:lvl>
-    <w:lvl w:ilvl="8">
-      <w:numFmt w:val="bullet"/>
-      <w:lvlText w:val="•"/>
-      <w:lvlJc w:val="left"/>
-      <w:pPr>
-        <w:ind w:left="6480" w:hanging="480"/>
-      </w:pPr>
-    </w:lvl>
-  </w:abstractNum>
   <w:num w:numId="1000">
     <w:abstractNumId w:val="990"/>
   </w:num>
   <w:num w:numId="1001">
+    <w:abstractNumId w:val="991"/>
+  </w:num>
+  <w:num w:numId="1002">
     <w:abstractNumId w:val="99411"/>
     <w:lvlOverride w:ilvl="0">
       <w:startOverride w:val="1"/>
@@ -3262,46 +3536,13 @@
       <w:startOverride w:val="1"/>
     </w:lvlOverride>
   </w:num>
-  <w:num w:numId="1002">
+  <w:num w:numId="1003">
     <w:abstractNumId w:val="991"/>
-  </w:num>
-  <w:num w:numId="1003">
-    <w:abstractNumId w:val="99411"/>
-    <w:lvlOverride w:ilvl="0">
-      <w:startOverride w:val="1"/>
-    </w:lvlOverride>
-    <w:lvlOverride w:ilvl="1">
-      <w:startOverride w:val="1"/>
-    </w:lvlOverride>
-    <w:lvlOverride w:ilvl="2">
-      <w:startOverride w:val="1"/>
-    </w:lvlOverride>
-    <w:lvlOverride w:ilvl="3">
-      <w:startOverride w:val="1"/>
-    </w:lvlOverride>
-    <w:lvlOverride w:ilvl="4">
-      <w:startOverride w:val="1"/>
-    </w:lvlOverride>
-    <w:lvlOverride w:ilvl="5">
-      <w:startOverride w:val="1"/>
-    </w:lvlOverride>
-    <w:lvlOverride w:ilvl="6">
-      <w:startOverride w:val="1"/>
-    </w:lvlOverride>
-    <w:lvlOverride w:ilvl="7">
-      <w:startOverride w:val="1"/>
-    </w:lvlOverride>
-    <w:lvlOverride w:ilvl="8">
-      <w:startOverride w:val="1"/>
-    </w:lvlOverride>
   </w:num>
   <w:num w:numId="1004">
     <w:abstractNumId w:val="991"/>
   </w:num>
   <w:num w:numId="1005">
-    <w:abstractNumId w:val="991"/>
-  </w:num>
-  <w:num w:numId="1006">
     <w:abstractNumId w:val="99411"/>
     <w:lvlOverride w:ilvl="0">
       <w:startOverride w:val="1"/>

</xml_diff>

<commit_message>
site: sync 2026-10-19 18:31
</commit_message>
<xml_diff>
--- a/documents/files/segmentation.docx
+++ b/documents/files/segmentation.docx
@@ -195,8 +195,8 @@
         <w:tblLook w:firstRow="1" w:lastRow="0" w:firstColumn="0" w:lastColumn="0" w:noHBand="0" w:noVBand="0" w:val="0020"/>
       </w:tblPr>
       <w:tblGrid>
-        <w:gridCol w:w="2010"/>
-        <w:gridCol w:w="7628"/>
+        <w:gridCol w:w="1549"/>
+        <w:gridCol w:w="8089"/>
       </w:tblGrid>
       <w:tr>
         <w:trPr>
@@ -204,7 +204,7 @@
         </w:trPr>
         <w:tc>
           <w:tcPr>
-            <w:tcW w:w="2010" w:type="dxa"/>
+            <w:tcW w:w="1549" w:type="dxa"/>
           </w:tcPr>
           <w:p>
             <w:pPr>
@@ -218,7 +218,7 @@
         </w:tc>
         <w:tc>
           <w:tcPr>
-            <w:tcW w:w="7628" w:type="dxa"/>
+            <w:tcW w:w="8089" w:type="dxa"/>
           </w:tcPr>
           <w:p>
             <w:pPr>
@@ -234,7 +234,7 @@
       <w:tr>
         <w:tc>
           <w:tcPr>
-            <w:tcW w:w="2010" w:type="dxa"/>
+            <w:tcW w:w="1549" w:type="dxa"/>
           </w:tcPr>
           <w:p>
             <w:pPr>
@@ -248,7 +248,7 @@
         </w:tc>
         <w:tc>
           <w:tcPr>
-            <w:tcW w:w="7628" w:type="dxa"/>
+            <w:tcW w:w="8089" w:type="dxa"/>
           </w:tcPr>
           <w:p>
             <w:pPr>
@@ -276,7 +276,7 @@
       <w:tr>
         <w:tc>
           <w:tcPr>
-            <w:tcW w:w="2010" w:type="dxa"/>
+            <w:tcW w:w="1549" w:type="dxa"/>
           </w:tcPr>
           <w:p>
             <w:pPr>
@@ -290,7 +290,7 @@
         </w:tc>
         <w:tc>
           <w:tcPr>
-            <w:tcW w:w="7628" w:type="dxa"/>
+            <w:tcW w:w="8089" w:type="dxa"/>
           </w:tcPr>
           <w:p>
             <w:pPr>
@@ -306,7 +306,7 @@
       <w:tr>
         <w:tc>
           <w:tcPr>
-            <w:tcW w:w="2010" w:type="dxa"/>
+            <w:tcW w:w="1549" w:type="dxa"/>
           </w:tcPr>
           <w:p>
             <w:pPr>
@@ -320,7 +320,7 @@
         </w:tc>
         <w:tc>
           <w:tcPr>
-            <w:tcW w:w="7628" w:type="dxa"/>
+            <w:tcW w:w="8089" w:type="dxa"/>
           </w:tcPr>
           <w:p>
             <w:pPr>
@@ -336,7 +336,7 @@
       <w:tr>
         <w:tc>
           <w:tcPr>
-            <w:tcW w:w="2010" w:type="dxa"/>
+            <w:tcW w:w="1549" w:type="dxa"/>
           </w:tcPr>
           <w:p>
             <w:pPr>
@@ -350,7 +350,7 @@
         </w:tc>
         <w:tc>
           <w:tcPr>
-            <w:tcW w:w="7628" w:type="dxa"/>
+            <w:tcW w:w="8089" w:type="dxa"/>
           </w:tcPr>
           <w:p>
             <w:pPr>
@@ -366,29 +366,51 @@
       <w:tr>
         <w:tc>
           <w:tcPr>
-            <w:tcW w:w="2010" w:type="dxa"/>
-          </w:tcPr>
-          <w:p>
-            <w:pPr>
-              <w:pStyle w:val="Compact"/>
-              <w:jc w:val="left"/>
-            </w:pPr>
-            <w:r>
-              <w:t xml:space="preserve">集成</w:t>
-            </w:r>
-          </w:p>
-        </w:tc>
-        <w:tc>
-          <w:tcPr>
-            <w:tcW w:w="7628" w:type="dxa"/>
-          </w:tcPr>
-          <w:p>
-            <w:pPr>
-              <w:pStyle w:val="Compact"/>
-              <w:jc w:val="left"/>
-            </w:pPr>
-            <w:r>
-              <w:t xml:space="preserve">3 模型（</w:t>
+            <w:tcW w:w="1549" w:type="dxa"/>
+          </w:tcPr>
+          <w:p>
+            <w:pPr>
+              <w:pStyle w:val="Compact"/>
+              <w:jc w:val="left"/>
+            </w:pPr>
+            <w:r>
+              <w:t xml:space="preserve">训练与模型</w:t>
+            </w:r>
+          </w:p>
+        </w:tc>
+        <w:tc>
+          <w:tcPr>
+            <w:tcW w:w="8089" w:type="dxa"/>
+          </w:tcPr>
+          <w:p>
+            <w:pPr>
+              <w:pStyle w:val="Compact"/>
+              <w:jc w:val="left"/>
+            </w:pPr>
+            <w:r>
+              <w:rPr>
+                <w:b/>
+                <w:bCs/>
+              </w:rPr>
+              <w:t xml:space="preserve">主模型</w:t>
+            </w:r>
+            <w:r>
+              <w:rPr>
+                <w:b/>
+                <w:bCs/>
+              </w:rPr>
+              <w:t xml:space="preserve"> </w:t>
+            </w:r>
+            <w:r>
+              <w:rPr>
+                <w:rStyle w:val="VerbatimChar"/>
+                <w:b/>
+                <w:bCs/>
+              </w:rPr>
+              <w:t xml:space="preserve">edge_final_single</w:t>
+            </w:r>
+            <w:r>
+              <w:t xml:space="preserve">：seed 20261019、60 epoch × 32768 合成矩阵、早停 epoch 24、11.3 min（chip 0）；另有 3 模型集成（</w:t>
             </w:r>
             <w:r>
               <w:rPr>
@@ -397,7 +419,7 @@
               <w:t xml:space="preserve">edge_s20260713/14/15</w:t>
             </w:r>
             <w:r>
-              <w:t xml:space="preserve">），无 TTA，单卡 NPU</w:t>
+              <w:t xml:space="preserve">）作对照</w:t>
             </w:r>
           </w:p>
         </w:tc>
@@ -405,7 +427,7 @@
       <w:tr>
         <w:tc>
           <w:tcPr>
-            <w:tcW w:w="2010" w:type="dxa"/>
+            <w:tcW w:w="1549" w:type="dxa"/>
           </w:tcPr>
           <w:p>
             <w:pPr>
@@ -419,7 +441,7 @@
         </w:tc>
         <w:tc>
           <w:tcPr>
-            <w:tcW w:w="7628" w:type="dxa"/>
+            <w:tcW w:w="8089" w:type="dxa"/>
           </w:tcPr>
           <w:p>
             <w:pPr>
@@ -430,10 +452,10 @@
               <w:rPr>
                 <w:rStyle w:val="VerbatimChar"/>
               </w:rPr>
-              <w:t xml:space="preserve">daninet/runs/edge_s2026071*/</w:t>
-            </w:r>
-            <w:r>
-              <w:t xml:space="preserve">、</w:t>
+              <w:t xml:space="preserve">daninet/runs/edge_final_single/</w:t>
+            </w:r>
+            <w:r>
+              <w:t xml:space="preserve">（主模型）、</w:t>
             </w:r>
             <w:r>
               <w:rPr>
@@ -441,13 +463,16 @@
               </w:rPr>
               <w:t xml:space="preserve">daninet/runs/edge_ensemble3_notta/</w:t>
             </w:r>
+            <w:r>
+              <w:t xml:space="preserve">（集成评估）</w:t>
+            </w:r>
           </w:p>
         </w:tc>
       </w:tr>
       <w:tr>
         <w:tc>
           <w:tcPr>
-            <w:tcW w:w="2010" w:type="dxa"/>
+            <w:tcW w:w="1549" w:type="dxa"/>
           </w:tcPr>
           <w:p>
             <w:pPr>
@@ -461,7 +486,7 @@
         </w:tc>
         <w:tc>
           <w:tcPr>
-            <w:tcW w:w="7628" w:type="dxa"/>
+            <w:tcW w:w="8089" w:type="dxa"/>
           </w:tcPr>
           <w:p>
             <w:pPr>
@@ -481,7 +506,7 @@
               <w:t xml:space="preserve">min_block2/uniform</w:t>
             </w:r>
             <w:r>
-              <w:t xml:space="preserve">；阈值 14→0.55、17→0.60</w:t>
+              <w:t xml:space="preserve">（相对 uniform 仅 +0.08pp，决策层已近最优）；阈值 14→0.55、17→0.60</w:t>
             </w:r>
           </w:p>
         </w:tc>
@@ -489,7 +514,7 @@
       <w:tr>
         <w:tc>
           <w:tcPr>
-            <w:tcW w:w="2010" w:type="dxa"/>
+            <w:tcW w:w="1549" w:type="dxa"/>
           </w:tcPr>
           <w:p>
             <w:pPr>
@@ -503,7 +528,7 @@
         </w:tc>
         <w:tc>
           <w:tcPr>
-            <w:tcW w:w="7628" w:type="dxa"/>
+            <w:tcW w:w="8089" w:type="dxa"/>
           </w:tcPr>
           <w:p>
             <w:pPr>
@@ -515,7 +540,10 @@
                 <w:b/>
                 <w:bCs/>
               </w:rPr>
-              <w:t xml:space="preserve">0.689</w:t>
+              <w:t xml:space="preserve">0.6872</w:t>
+            </w:r>
+            <w:r>
+              <w:t xml:space="preserve">（单模型）；3 模型集成 0.6890 [0.6744, 0.7034]</w:t>
             </w:r>
           </w:p>
         </w:tc>
@@ -523,7 +551,7 @@
       <w:tr>
         <w:tc>
           <w:tcPr>
-            <w:tcW w:w="2010" w:type="dxa"/>
+            <w:tcW w:w="1549" w:type="dxa"/>
           </w:tcPr>
           <w:p>
             <w:pPr>
@@ -537,15 +565,15 @@
         </w:tc>
         <w:tc>
           <w:tcPr>
-            <w:tcW w:w="7628" w:type="dxa"/>
-          </w:tcPr>
-          <w:p>
-            <w:pPr>
-              <w:pStyle w:val="Compact"/>
-              <w:jc w:val="left"/>
-            </w:pPr>
-            <w:r>
-              <w:t xml:space="preserve">0.812 / 0.845</w:t>
+            <w:tcW w:w="8089" w:type="dxa"/>
+          </w:tcPr>
+          <w:p>
+            <w:pPr>
+              <w:pStyle w:val="Compact"/>
+              <w:jc w:val="left"/>
+            </w:pPr>
+            <w:r>
+              <w:t xml:space="preserve">0.813 / 0.839（集成 0.812 / 0.845）</w:t>
             </w:r>
           </w:p>
         </w:tc>
@@ -553,7 +581,7 @@
       <w:tr>
         <w:tc>
           <w:tcPr>
-            <w:tcW w:w="2010" w:type="dxa"/>
+            <w:tcW w:w="1549" w:type="dxa"/>
           </w:tcPr>
           <w:p>
             <w:pPr>
@@ -567,15 +595,15 @@
         </w:tc>
         <w:tc>
           <w:tcPr>
-            <w:tcW w:w="7628" w:type="dxa"/>
-          </w:tcPr>
-          <w:p>
-            <w:pPr>
-              <w:pStyle w:val="Compact"/>
-              <w:jc w:val="left"/>
-            </w:pPr>
-            <w:r>
-              <w:t xml:space="preserve">0.308（过分割 10.0% / 欠分割 14.9%）</w:t>
+            <w:tcW w:w="8089" w:type="dxa"/>
+          </w:tcPr>
+          <w:p>
+            <w:pPr>
+              <w:pStyle w:val="Compact"/>
+              <w:jc w:val="left"/>
+            </w:pPr>
+            <w:r>
+              <w:t xml:space="preserve">0.320（集成 0.308：过分割 10.0% / 欠分割 14.9%）</w:t>
             </w:r>
           </w:p>
         </w:tc>
@@ -583,7 +611,7 @@
       <w:tr>
         <w:tc>
           <w:tcPr>
-            <w:tcW w:w="2010" w:type="dxa"/>
+            <w:tcW w:w="1549" w:type="dxa"/>
           </w:tcPr>
           <w:p>
             <w:pPr>
@@ -597,15 +625,15 @@
         </w:tc>
         <w:tc>
           <w:tcPr>
-            <w:tcW w:w="7628" w:type="dxa"/>
-          </w:tcPr>
-          <w:p>
-            <w:pPr>
-              <w:pStyle w:val="Compact"/>
-              <w:jc w:val="left"/>
-            </w:pPr>
-            <w:r>
-              <w:t xml:space="preserve">Exact 0.577 / Rect F1 0.744 / Boundary F1 0.720</w:t>
+            <w:tcW w:w="8089" w:type="dxa"/>
+          </w:tcPr>
+          <w:p>
+            <w:pPr>
+              <w:pStyle w:val="Compact"/>
+              <w:jc w:val="left"/>
+            </w:pPr>
+            <w:r>
+              <w:t xml:space="preserve">Exact 0.592（单模型）；集成 0.577，错误模式反转为过分割（over 37.3% / under 2.5%）</w:t>
             </w:r>
           </w:p>
         </w:tc>
@@ -613,7 +641,7 @@
       <w:tr>
         <w:tc>
           <w:tcPr>
-            <w:tcW w:w="2010" w:type="dxa"/>
+            <w:tcW w:w="1549" w:type="dxa"/>
           </w:tcPr>
           <w:p>
             <w:pPr>
@@ -627,7 +655,7 @@
         </w:tc>
         <w:tc>
           <w:tcPr>
-            <w:tcW w:w="7628" w:type="dxa"/>
+            <w:tcW w:w="8089" w:type="dxa"/>
           </w:tcPr>
           <w:p>
             <w:pPr>
@@ -653,7 +681,7 @@
         <w:t xml:space="preserve">按视数的 Exact</w:t>
       </w:r>
       <w:r>
-        <w:t xml:space="preserve">（集成评估，n=640/视数）：L=9 → 32.3%，L=16 → 51.2%，L=25 → 66.5%，L=36 → 77.1%，L=49 → 85.4%，L=121 →</w:t>
+        <w:t xml:space="preserve">（主模型冻结测试）：L=9 → 31.2%，L=16 → 54.8%，L=25 → 66.5%，L=36 → 77.5%，L=49 → 86.0%，L=121 →</w:t>
       </w:r>
       <w:r>
         <w:t xml:space="preserve"> </w:t>
@@ -663,7 +691,7 @@
           <w:b/>
           <w:bCs/>
         </w:rPr>
-        <w:t xml:space="preserve">97.4%</w:t>
+        <w:t xml:space="preserve">97.7%</w:t>
       </w:r>
       <w:r>
         <w:t xml:space="preserve">。相干估计越稳，切分越准，单调上升。</w:t>

</xml_diff>

<commit_message>
site: sync 2026-10-23 00:31
</commit_message>
<xml_diff>
--- a/documents/files/segmentation.docx
+++ b/documents/files/segmentation.docx
@@ -3502,13 +3502,310 @@
       </w:r>
     </w:p>
     <w:bookmarkEnd w:id="34"/>
-    <w:bookmarkStart w:id="35" w:name="七路线对照"/>
+    <w:bookmarkStart w:id="35" w:name="七真实数据初检111-组2026-10-23"/>
     <w:p>
       <w:pPr>
         <w:pStyle w:val="Heading2"/>
       </w:pPr>
       <w:r>
-        <w:t xml:space="preserve">七、路线对照</w:t>
+        <w:t xml:space="preserve">七、真实数据初检（111 组，2026-10-23）</w:t>
+      </w:r>
+    </w:p>
+    <w:p>
+      <w:pPr>
+        <w:pStyle w:val="FirstParagraph"/>
+      </w:pPr>
+      <w:r>
+        <w:rPr>
+          <w:rStyle w:val="VerbatimChar"/>
+        </w:rPr>
+        <w:t xml:space="preserve">workspace/111_unlabeled/111/</w:t>
+      </w:r>
+      <w:r>
+        <w:t xml:space="preserve">：</w:t>
+      </w:r>
+      <w:r>
+        <w:rPr>
+          <w:b/>
+          <w:bCs/>
+        </w:rPr>
+        <w:t xml:space="preserve">13,145</w:t>
+      </w:r>
+      <w:r>
+        <w:t xml:space="preserve"> </w:t>
+      </w:r>
+      <w:r>
+        <w:t xml:space="preserve">个 N=10 非负相干矩阵，分属</w:t>
+      </w:r>
+      <w:r>
+        <w:t xml:space="preserve"> </w:t>
+      </w:r>
+      <w:r>
+        <w:rPr>
+          <w:b/>
+          <w:bCs/>
+        </w:rPr>
+        <w:t xml:space="preserve">9 个来源组</w:t>
+      </w:r>
+      <w:r>
+        <w:t xml:space="preserve">（</w:t>
+      </w:r>
+      <w:r>
+        <w:rPr>
+          <w:rStyle w:val="VerbatimChar"/>
+        </w:rPr>
+        <w:t xml:space="preserve">mat_choose_1…9</w:t>
+      </w:r>
+      <w:r>
+        <w:t xml:space="preserve">）。这批数据</w:t>
+      </w:r>
+      <w:r>
+        <w:rPr>
+          <w:b/>
+          <w:bCs/>
+        </w:rPr>
+        <w:t xml:space="preserve">无标签</w:t>
+      </w:r>
+      <w:r>
+        <w:t xml:space="preserve">，只能做无监督一致性检查：</w:t>
+      </w:r>
+    </w:p>
+    <w:tbl>
+      <w:tblPr>
+        <w:tblStyle w:val="Table"/>
+        <w:tblW w:type="dxa" w:w="9638"/>
+        <w:jc w:val="left"/>
+        <w:tblLook w:firstRow="1" w:lastRow="0" w:firstColumn="0" w:lastColumn="0" w:noHBand="0" w:noVBand="0" w:val="0020"/>
+      </w:tblPr>
+      <w:tblGrid>
+        <w:gridCol w:w="2412"/>
+        <w:gridCol w:w="7226"/>
+      </w:tblGrid>
+      <w:tr>
+        <w:trPr>
+          <w:tblHeader w:val="on"/>
+        </w:trPr>
+        <w:tc>
+          <w:tcPr>
+            <w:tcW w:w="2412" w:type="dxa"/>
+          </w:tcPr>
+          <w:p>
+            <w:pPr>
+              <w:pStyle w:val="Compact"/>
+              <w:jc w:val="left"/>
+            </w:pPr>
+            <w:r>
+              <w:t xml:space="preserve">项</w:t>
+            </w:r>
+          </w:p>
+        </w:tc>
+        <w:tc>
+          <w:tcPr>
+            <w:tcW w:w="7226" w:type="dxa"/>
+          </w:tcPr>
+          <w:p>
+            <w:pPr>
+              <w:pStyle w:val="Compact"/>
+              <w:jc w:val="left"/>
+            </w:pPr>
+            <w:r>
+              <w:t xml:space="preserve">结果</w:t>
+            </w:r>
+          </w:p>
+        </w:tc>
+      </w:tr>
+      <w:tr>
+        <w:tc>
+          <w:tcPr>
+            <w:tcW w:w="2412" w:type="dxa"/>
+          </w:tcPr>
+          <w:p>
+            <w:pPr>
+              <w:pStyle w:val="Compact"/>
+              <w:jc w:val="left"/>
+            </w:pPr>
+            <w:r>
+              <w:t xml:space="preserve">自动选 K 分布</w:t>
+            </w:r>
+          </w:p>
+        </w:tc>
+        <w:tc>
+          <w:tcPr>
+            <w:tcW w:w="7226" w:type="dxa"/>
+          </w:tcPr>
+          <w:p>
+            <w:pPr>
+              <w:pStyle w:val="Compact"/>
+              <w:jc w:val="left"/>
+            </w:pPr>
+            <w:r>
+              <w:t xml:space="preserve">1 个切点 6,548（49.8%）· 2 个 6,155（46.8%）· 3 个 441 · 4 个 1</w:t>
+            </w:r>
+          </w:p>
+        </w:tc>
+      </w:tr>
+      <w:tr>
+        <w:tc>
+          <w:tcPr>
+            <w:tcW w:w="2412" w:type="dxa"/>
+          </w:tcPr>
+          <w:p>
+            <w:pPr>
+              <w:pStyle w:val="Compact"/>
+              <w:jc w:val="left"/>
+            </w:pPr>
+            <w:r>
+              <w:t xml:space="preserve">视数估计</w:t>
+            </w:r>
+            <w:r>
+              <w:t xml:space="preserve"> </w:t>
+            </w:r>
+            <w:r>
+              <w:rPr>
+                <w:rStyle w:val="VerbatimChar"/>
+              </w:rPr>
+              <w:t xml:space="preserve">L̂</w:t>
+            </w:r>
+          </w:p>
+        </w:tc>
+        <w:tc>
+          <w:tcPr>
+            <w:tcW w:w="7226" w:type="dxa"/>
+          </w:tcPr>
+          <w:p>
+            <w:pPr>
+              <w:pStyle w:val="Compact"/>
+              <w:jc w:val="left"/>
+            </w:pPr>
+            <w:r>
+              <w:t xml:space="preserve">中位数</w:t>
+            </w:r>
+            <w:r>
+              <w:t xml:space="preserve"> </w:t>
+            </w:r>
+            <w:r>
+              <w:rPr>
+                <w:b/>
+                <w:bCs/>
+              </w:rPr>
+              <w:t xml:space="preserve">24.1</w:t>
+            </w:r>
+            <w:r>
+              <w:t xml:space="preserve">（q10 11.6 / q90 65.1）</w:t>
+            </w:r>
+          </w:p>
+        </w:tc>
+      </w:tr>
+      <w:tr>
+        <w:tc>
+          <w:tcPr>
+            <w:tcW w:w="2412" w:type="dxa"/>
+          </w:tcPr>
+          <w:p>
+            <w:pPr>
+              <w:pStyle w:val="Compact"/>
+              <w:jc w:val="left"/>
+            </w:pPr>
+            <w:r>
+              <w:t xml:space="preserve">尺寸</w:t>
+            </w:r>
+          </w:p>
+        </w:tc>
+        <w:tc>
+          <w:tcPr>
+            <w:tcW w:w="7226" w:type="dxa"/>
+          </w:tcPr>
+          <w:p>
+            <w:pPr>
+              <w:pStyle w:val="Compact"/>
+              <w:jc w:val="left"/>
+            </w:pPr>
+            <w:r>
+              <w:t xml:space="preserve">N=10（真实尺寸，训练时未见，属零样本）</w:t>
+            </w:r>
+          </w:p>
+        </w:tc>
+      </w:tr>
+      <w:tr>
+        <w:tc>
+          <w:tcPr>
+            <w:tcW w:w="2412" w:type="dxa"/>
+          </w:tcPr>
+          <w:p>
+            <w:pPr>
+              <w:pStyle w:val="Compact"/>
+              <w:jc w:val="left"/>
+            </w:pPr>
+            <w:r>
+              <w:t xml:space="preserve">产物</w:t>
+            </w:r>
+          </w:p>
+        </w:tc>
+        <w:tc>
+          <w:tcPr>
+            <w:tcW w:w="7226" w:type="dxa"/>
+          </w:tcPr>
+          <w:p>
+            <w:pPr>
+              <w:pStyle w:val="Compact"/>
+              <w:jc w:val="left"/>
+            </w:pPr>
+            <w:r>
+              <w:rPr>
+                <w:rStyle w:val="VerbatimChar"/>
+              </w:rPr>
+              <w:t xml:space="preserve">daninet/out/111_validation/{predictions.csv, montage_8panels.png, sample_*.png}</w:t>
+            </w:r>
+          </w:p>
+        </w:tc>
+      </w:tr>
+    </w:tbl>
+    <w:p>
+      <w:pPr>
+        <w:pStyle w:val="BodyText"/>
+      </w:pPr>
+      <w:r>
+        <w:rPr>
+          <w:b/>
+          <w:bCs/>
+        </w:rPr>
+        <w:t xml:space="preserve">能说的</w:t>
+      </w:r>
+      <w:r>
+        <w:t xml:space="preserve">：DP 在这批真实矩阵上给出的切分数与视数分布合理，与合成训练分布不冲突。</w:t>
+      </w:r>
+      <w:r>
+        <w:t xml:space="preserve"> </w:t>
+      </w:r>
+      <w:r>
+        <w:rPr>
+          <w:b/>
+          <w:bCs/>
+        </w:rPr>
+        <w:t xml:space="preserve">不能说的</w:t>
+      </w:r>
+      <w:r>
+        <w:t xml:space="preserve">：没有真值，任何精度数字都不成立；CNN 在 N=10 的 0.7283 来自</w:t>
+      </w:r>
+      <w:r>
+        <w:rPr>
+          <w:b/>
+          <w:bCs/>
+        </w:rPr>
+        <w:t xml:space="preserve">合成</w:t>
+      </w:r>
+      <w:r>
+        <w:t xml:space="preserve">测试集，不是这 111 组。</w:t>
+      </w:r>
+    </w:p>
+    <w:bookmarkEnd w:id="35"/>
+    <w:bookmarkStart w:id="36" w:name="八路线对照"/>
+    <w:p>
+      <w:pPr>
+        <w:pStyle w:val="Heading2"/>
+      </w:pPr>
+      <w:r>
+        <w:t xml:space="preserve">八、路线对照</w:t>
       </w:r>
     </w:p>
     <w:p>
@@ -3601,14 +3898,14 @@
         </w:pict>
       </w:r>
     </w:p>
-    <w:bookmarkEnd w:id="35"/>
-    <w:bookmarkStart w:id="36" w:name="八术语与指标"/>
+    <w:bookmarkEnd w:id="36"/>
+    <w:bookmarkStart w:id="37" w:name="九术语与指标"/>
     <w:p>
       <w:pPr>
         <w:pStyle w:val="Heading2"/>
       </w:pPr>
       <w:r>
-        <w:t xml:space="preserve">八、术语与指标</w:t>
+        <w:t xml:space="preserve">九、术语与指标</w:t>
       </w:r>
     </w:p>
     <w:tbl>
@@ -3903,14 +4200,14 @@
         </w:pict>
       </w:r>
     </w:p>
-    <w:bookmarkEnd w:id="36"/>
-    <w:bookmarkStart w:id="37" w:name="九文档维护"/>
+    <w:bookmarkEnd w:id="37"/>
+    <w:bookmarkStart w:id="38" w:name="十文档维护"/>
     <w:p>
       <w:pPr>
         <w:pStyle w:val="Heading2"/>
       </w:pPr>
       <w:r>
-        <w:t xml:space="preserve">九、文档维护</w:t>
+        <w:t xml:space="preserve">十、文档维护</w:t>
       </w:r>
     </w:p>
     <w:p>
@@ -3995,7 +4292,7 @@
         <w:t xml:space="preserve">指标定义变更时先改第五节，再同步其他章节。</w:t>
       </w:r>
     </w:p>
-    <w:bookmarkEnd w:id="37"/>
+    <w:bookmarkEnd w:id="38"/>
     <w:sectPr>
       <w:footerReference w:type="default" r:id="rId9"/>
     </w:sectPr>

</xml_diff>